<commit_message>
Update LOI template with split Seller Rollover marker/content paragraphs
Template updated to separate the instruction marker into its own paragraph,
with the Seller Rollover content in the following paragraph.

Co-Authored-By: Claude Opus 4.6 <noreply@anthropic.com>
</commit_message>
<xml_diff>
--- a/Templates/LOI_Template.docx
+++ b/Templates/LOI_Template.docx
@@ -923,7 +923,23 @@
           <w:sz w:val="22"/>
           <w:szCs w:val="22"/>
         </w:rPr>
-        <w:t>(i) Purchaser’s receipt of Governmental Approvals</w:t>
+        <w:t>(</w:t>
+      </w:r>
+      <w:proofErr w:type="spellStart"/>
+      <w:r>
+        <w:rPr>
+          <w:sz w:val="22"/>
+          <w:szCs w:val="22"/>
+        </w:rPr>
+        <w:t>i</w:t>
+      </w:r>
+      <w:proofErr w:type="spellEnd"/>
+      <w:r>
+        <w:rPr>
+          <w:sz w:val="22"/>
+          <w:szCs w:val="22"/>
+        </w:rPr>
+        <w:t>) Purchaser’s receipt of Governmental Approvals</w:t>
       </w:r>
       <w:r>
         <w:rPr>
@@ -1402,7 +1418,23 @@
           <w:sz w:val="22"/>
           <w:szCs w:val="22"/>
         </w:rPr>
-        <w:t xml:space="preserve"> (i)</w:t>
+        <w:t xml:space="preserve"> (</w:t>
+      </w:r>
+      <w:proofErr w:type="spellStart"/>
+      <w:r>
+        <w:rPr>
+          <w:sz w:val="22"/>
+          <w:szCs w:val="22"/>
+        </w:rPr>
+        <w:t>i</w:t>
+      </w:r>
+      <w:proofErr w:type="spellEnd"/>
+      <w:r>
+        <w:rPr>
+          <w:sz w:val="22"/>
+          <w:szCs w:val="22"/>
+        </w:rPr>
+        <w:t>)</w:t>
       </w:r>
       <w:r>
         <w:rPr>
@@ -1759,7 +1791,23 @@
           <w:sz w:val="22"/>
           <w:szCs w:val="22"/>
         </w:rPr>
-        <w:t>subject to (i) Purchaser’s receipt of the Governmental Approvals during the Governmental Approvals Period (as defined below), (ii) a default by Seller under the Purchase Agreement</w:t>
+        <w:t>subject to (</w:t>
+      </w:r>
+      <w:proofErr w:type="spellStart"/>
+      <w:r>
+        <w:rPr>
+          <w:sz w:val="22"/>
+          <w:szCs w:val="22"/>
+        </w:rPr>
+        <w:t>i</w:t>
+      </w:r>
+      <w:proofErr w:type="spellEnd"/>
+      <w:r>
+        <w:rPr>
+          <w:sz w:val="22"/>
+          <w:szCs w:val="22"/>
+        </w:rPr>
+        <w:t>) Purchaser’s receipt of the Governmental Approvals during the Governmental Approvals Period (as defined below), (ii) a default by Seller under the Purchase Agreement</w:t>
       </w:r>
       <w:r>
         <w:rPr>
@@ -4159,8 +4207,12 @@
         </w:numPr>
         <w:ind w:firstLine="990"/>
         <w:rPr>
-          <w:sz w:val="22"/>
-          <w:szCs w:val="22"/>
+          <w:b/>
+          <w:bCs/>
+          <w:sz w:val="22"/>
+          <w:szCs w:val="22"/>
+          <w:highlight w:val="yellow"/>
+          <w:u w:val="single"/>
         </w:rPr>
       </w:pPr>
       <w:r>
@@ -4220,7 +4272,32 @@
           <w:highlight w:val="yellow"/>
           <w:u w:val="single"/>
         </w:rPr>
-        <w:t xml:space="preserve"> Seller</w:t>
+        <w:t xml:space="preserve"> </w:t>
+      </w:r>
+    </w:p>
+    <w:p>
+      <w:pPr>
+        <w:pStyle w:val="StandardL1"/>
+        <w:numPr>
+          <w:ilvl w:val="0"/>
+          <w:numId w:val="0"/>
+        </w:numPr>
+        <w:ind w:firstLine="990"/>
+        <w:rPr>
+          <w:sz w:val="22"/>
+          <w:szCs w:val="22"/>
+        </w:rPr>
+      </w:pPr>
+      <w:r>
+        <w:rPr>
+          <w:b/>
+          <w:bCs/>
+          <w:sz w:val="22"/>
+          <w:szCs w:val="22"/>
+          <w:highlight w:val="yellow"/>
+          <w:u w:val="single"/>
+        </w:rPr>
+        <w:t>Seller</w:t>
       </w:r>
       <w:r>
         <w:rPr>
@@ -7195,13 +7272,15 @@
   </w:style>
   <w:style w:type="character" w:default="1" w:styleId="DefaultParagraphFont">
     <w:name w:val="Default Paragraph Font"/>
+    <w:uiPriority w:val="1"/>
     <w:semiHidden/>
-    <w:rsid w:val="00BA0D86"/>
+    <w:unhideWhenUsed/>
   </w:style>
   <w:style w:type="table" w:default="1" w:styleId="TableNormal">
     <w:name w:val="Normal Table"/>
+    <w:uiPriority w:val="99"/>
     <w:semiHidden/>
-    <w:rsid w:val="00BA0D86"/>
+    <w:unhideWhenUsed/>
     <w:tblPr>
       <w:tblInd w:w="0" w:type="dxa"/>
       <w:tblCellMar>
@@ -7214,8 +7293,9 @@
   </w:style>
   <w:style w:type="numbering" w:default="1" w:styleId="NoList">
     <w:name w:val="No List"/>
+    <w:uiPriority w:val="99"/>
     <w:semiHidden/>
-    <w:rsid w:val="00BA0D86"/>
+    <w:unhideWhenUsed/>
   </w:style>
   <w:style w:type="paragraph" w:styleId="BodyText">
     <w:name w:val="Body Text"/>
@@ -7905,6 +7985,15 @@
 </file>
 
 <file path=customXml/item1.xml><?xml version="1.0" encoding="utf-8"?>
+<?mso-contentType ?>
+<FormTemplates xmlns="http://schemas.microsoft.com/sharepoint/v3/contenttype/forms">
+  <Display>DocumentLibraryForm</Display>
+  <Edit>DocumentLibraryForm</Edit>
+  <New>DocumentLibraryForm</New>
+</FormTemplates>
+</file>
+
+<file path=customXml/item2.xml><?xml version="1.0" encoding="utf-8"?>
 <ct:contentTypeSchema xmlns:ct="http://schemas.microsoft.com/office/2006/metadata/contentType" xmlns:ma="http://schemas.microsoft.com/office/2006/metadata/properties/metaAttributes" ct:_="" ma:_="" ma:contentTypeName="Document" ma:contentTypeID="0x0101004A6F54FAD2137C4D9DF78C8843874E3C" ma:contentTypeVersion="20" ma:contentTypeDescription="Create a new document." ma:contentTypeScope="" ma:versionID="5c78336efc91a96d5c4d6ec8b99a1182">
   <xsd:schema xmlns:xsd="http://www.w3.org/2001/XMLSchema" xmlns:xs="http://www.w3.org/2001/XMLSchema" xmlns:p="http://schemas.microsoft.com/office/2006/metadata/properties" xmlns:ns2="23e146b3-f3f7-43ef-8902-31a1419272e5" xmlns:ns3="00b5ac78-2362-4493-8056-2401df405323" targetNamespace="http://schemas.microsoft.com/office/2006/metadata/properties" ma:root="true" ma:fieldsID="a5f46392e85981625a937ef86ff1fadb" ns2:_="" ns3:_="">
     <xsd:import namespace="23e146b3-f3f7-43ef-8902-31a1419272e5"/>
@@ -8178,20 +8267,7 @@
 </ct:contentTypeSchema>
 </file>
 
-<file path=customXml/item2.xml><?xml version="1.0" encoding="utf-8"?>
-<?mso-contentType ?>
-<FormTemplates xmlns="http://schemas.microsoft.com/sharepoint/v3/contenttype/forms">
-  <Display>DocumentLibraryForm</Display>
-  <Edit>DocumentLibraryForm</Edit>
-  <New>DocumentLibraryForm</New>
-</FormTemplates>
-</file>
-
 <file path=customXml/item3.xml><?xml version="1.0" encoding="utf-8"?>
-<LongProperties xmlns="http://schemas.microsoft.com/office/2006/metadata/longProperties"/>
-</file>
-
-<file path=customXml/item4.xml><?xml version="1.0" encoding="utf-8"?>
 <p:properties xmlns:p="http://schemas.microsoft.com/office/2006/metadata/properties" xmlns:xsi="http://www.w3.org/2001/XMLSchema-instance" xmlns:pc="http://schemas.microsoft.com/office/infopath/2007/PartnerControls">
   <documentManagement>
     <lcf76f155ced4ddcb4097134ff3c332f xmlns="23e146b3-f3f7-43ef-8902-31a1419272e5">
@@ -8206,7 +8282,19 @@
 </p:properties>
 </file>
 
+<file path=customXml/item4.xml><?xml version="1.0" encoding="utf-8"?>
+<LongProperties xmlns="http://schemas.microsoft.com/office/2006/metadata/longProperties"/>
+</file>
+
 <file path=customXml/itemProps1.xml><?xml version="1.0" encoding="utf-8"?>
+<ds:datastoreItem xmlns:ds="http://schemas.openxmlformats.org/officeDocument/2006/customXml" ds:itemID="{870376F7-0B6D-40C0-A5CF-B068169D7101}">
+  <ds:schemaRefs>
+    <ds:schemaRef ds:uri="http://schemas.microsoft.com/sharepoint/v3/contenttype/forms"/>
+  </ds:schemaRefs>
+</ds:datastoreItem>
+</file>
+
+<file path=customXml/itemProps2.xml><?xml version="1.0" encoding="utf-8"?>
 <ds:datastoreItem xmlns:ds="http://schemas.openxmlformats.org/officeDocument/2006/customXml" ds:itemID="{786DF23E-A9FB-4807-B87E-ED769DC1CB65}">
   <ds:schemaRefs>
     <ds:schemaRef ds:uri="http://schemas.microsoft.com/office/2006/metadata/contentType"/>
@@ -8225,23 +8313,7 @@
 </ds:datastoreItem>
 </file>
 
-<file path=customXml/itemProps2.xml><?xml version="1.0" encoding="utf-8"?>
-<ds:datastoreItem xmlns:ds="http://schemas.openxmlformats.org/officeDocument/2006/customXml" ds:itemID="{870376F7-0B6D-40C0-A5CF-B068169D7101}">
-  <ds:schemaRefs>
-    <ds:schemaRef ds:uri="http://schemas.microsoft.com/sharepoint/v3/contenttype/forms"/>
-  </ds:schemaRefs>
-</ds:datastoreItem>
-</file>
-
 <file path=customXml/itemProps3.xml><?xml version="1.0" encoding="utf-8"?>
-<ds:datastoreItem xmlns:ds="http://schemas.openxmlformats.org/officeDocument/2006/customXml" ds:itemID="{0D6CFFF2-989C-497B-AC36-F31689D09125}">
-  <ds:schemaRefs>
-    <ds:schemaRef ds:uri="http://schemas.microsoft.com/office/2006/metadata/longProperties"/>
-  </ds:schemaRefs>
-</ds:datastoreItem>
-</file>
-
-<file path=customXml/itemProps4.xml><?xml version="1.0" encoding="utf-8"?>
 <ds:datastoreItem xmlns:ds="http://schemas.openxmlformats.org/officeDocument/2006/customXml" ds:itemID="{1D1610B8-73E3-420F-8012-44A5C87745AF}">
   <ds:schemaRefs>
     <ds:schemaRef ds:uri="http://schemas.microsoft.com/office/2006/metadata/properties"/>
@@ -8250,4 +8322,12 @@
     <ds:schemaRef ds:uri="00b5ac78-2362-4493-8056-2401df405323"/>
   </ds:schemaRefs>
 </ds:datastoreItem>
+</file>
+
+<file path=customXml/itemProps4.xml><?xml version="1.0" encoding="utf-8"?>
+<ds:datastoreItem xmlns:ds="http://schemas.openxmlformats.org/officeDocument/2006/customXml" ds:itemID="{0D6CFFF2-989C-497B-AC36-F31689D09125}">
+  <ds:schemaRefs>
+    <ds:schemaRef ds:uri="http://schemas.microsoft.com/office/2006/metadata/longProperties"/>
+  </ds:schemaRefs>
+</ds:datastoreItem>
 </file>
</xml_diff>

<commit_message>
Update LOI template (20260325 RB) and align document generator markers
- Replace LOI_Template.docx with updated version from RB
- Update legal reimbursement marker to match new template wording
- Simplify seller rollover handler for new single-paragraph structure
- Add verify_template_verbiage.py test for comprehensive verbiage coverage

Co-Authored-By: Claude Opus 4.6 (1M context) <noreply@anthropic.com>
</commit_message>
<xml_diff>
--- a/Templates/LOI_Template.docx
+++ b/Templates/LOI_Template.docx
@@ -923,23 +923,535 @@
           <w:sz w:val="22"/>
           <w:szCs w:val="22"/>
         </w:rPr>
+        <w:t>(i) Purchaser’s receipt of Governmental Approvals</w:t>
+      </w:r>
+      <w:r>
+        <w:rPr>
+          <w:sz w:val="22"/>
+          <w:szCs w:val="22"/>
+        </w:rPr>
+        <w:t>,</w:t>
+      </w:r>
+      <w:r>
+        <w:rPr>
+          <w:sz w:val="22"/>
+          <w:szCs w:val="22"/>
+        </w:rPr>
+        <w:t xml:space="preserve"> during the Governmental Approvals Period (as defined below), (ii) a default by Seller under the Purchase Agreement</w:t>
+      </w:r>
+      <w:r>
+        <w:rPr>
+          <w:sz w:val="22"/>
+          <w:szCs w:val="22"/>
+        </w:rPr>
+        <w:t>,</w:t>
+      </w:r>
+      <w:r>
+        <w:rPr>
+          <w:sz w:val="22"/>
+          <w:szCs w:val="22"/>
+        </w:rPr>
+        <w:t xml:space="preserve"> or (iii) a casualty or a condemnation, each as shall be further defined in the Purchase Agreement.</w:t>
+      </w:r>
+      <w:r>
+        <w:rPr>
+          <w:sz w:val="22"/>
+          <w:szCs w:val="22"/>
+        </w:rPr>
+        <w:t xml:space="preserve"> </w:t>
+      </w:r>
+      <w:r>
+        <w:rPr>
+          <w:sz w:val="22"/>
+          <w:szCs w:val="22"/>
+        </w:rPr>
+        <w:t>If the</w:t>
+      </w:r>
+      <w:r>
+        <w:rPr>
+          <w:sz w:val="22"/>
+          <w:szCs w:val="22"/>
+        </w:rPr>
+        <w:t xml:space="preserve"> Purchaser has not obtained the Governmental Approvals during the Governmental Approvals Period, Purchaser may terminate the Purchase Agreement</w:t>
+      </w:r>
+      <w:r>
+        <w:rPr>
+          <w:sz w:val="22"/>
+          <w:szCs w:val="22"/>
+        </w:rPr>
+        <w:t>,</w:t>
+      </w:r>
+      <w:r>
+        <w:rPr>
+          <w:sz w:val="22"/>
+          <w:szCs w:val="22"/>
+        </w:rPr>
+        <w:t xml:space="preserve"> and the Earnest Money shall be fully and promptly refunded to Purchaser. Otherwise, the Earnest Money shall become non-refundable </w:t>
+      </w:r>
+      <w:r>
+        <w:rPr>
+          <w:sz w:val="22"/>
+          <w:szCs w:val="22"/>
+        </w:rPr>
+        <w:t xml:space="preserve">to the Purchaser </w:t>
+      </w:r>
+      <w:r>
+        <w:rPr>
+          <w:sz w:val="22"/>
+          <w:szCs w:val="22"/>
+        </w:rPr>
+        <w:t>upon expiration of the Governmental Approvals Period (except as expressly set forth in the Purchase Agreement).  The Earnest Money shall</w:t>
+      </w:r>
+      <w:r>
+        <w:rPr>
+          <w:color w:val="000000"/>
+          <w:sz w:val="22"/>
+          <w:szCs w:val="22"/>
+        </w:rPr>
+        <w:t xml:space="preserve"> be applied towards the Purchase Price at Closing.</w:t>
+      </w:r>
+      <w:r>
+        <w:rPr>
+          <w:color w:val="000000"/>
+          <w:sz w:val="22"/>
+          <w:szCs w:val="22"/>
+          <w:highlight w:val="yellow"/>
+        </w:rPr>
+        <w:t xml:space="preserve"> REMOVE </w:t>
+      </w:r>
+      <w:r>
+        <w:rPr>
+          <w:color w:val="000000"/>
+          <w:sz w:val="22"/>
+          <w:szCs w:val="22"/>
+          <w:highlight w:val="yellow"/>
+        </w:rPr>
+        <w:t xml:space="preserve">PARAGRAPH ABOVE </w:t>
+      </w:r>
+      <w:r>
+        <w:rPr>
+          <w:color w:val="000000"/>
+          <w:sz w:val="22"/>
+          <w:szCs w:val="22"/>
+          <w:highlight w:val="yellow"/>
+        </w:rPr>
+        <w:t>AND USE THE FOLLOWING</w:t>
+      </w:r>
+      <w:r>
+        <w:rPr>
+          <w:color w:val="000000"/>
+          <w:sz w:val="22"/>
+          <w:szCs w:val="22"/>
+          <w:highlight w:val="yellow"/>
+        </w:rPr>
+        <w:t xml:space="preserve"> PARAGRPAPH</w:t>
+      </w:r>
+      <w:r>
+        <w:rPr>
+          <w:color w:val="000000"/>
+          <w:sz w:val="22"/>
+          <w:szCs w:val="22"/>
+          <w:highlight w:val="yellow"/>
+        </w:rPr>
+        <w:t xml:space="preserve"> IF</w:t>
+      </w:r>
+      <w:r>
+        <w:rPr>
+          <w:color w:val="000000"/>
+          <w:sz w:val="22"/>
+          <w:szCs w:val="22"/>
+          <w:highlight w:val="yellow"/>
+        </w:rPr>
+        <w:t xml:space="preserve"> THE</w:t>
+      </w:r>
+      <w:r>
+        <w:rPr>
+          <w:color w:val="000000"/>
+          <w:sz w:val="22"/>
+          <w:szCs w:val="22"/>
+          <w:highlight w:val="yellow"/>
+        </w:rPr>
+        <w:t xml:space="preserve"> INITIAL DEPOSIT IS GOING HARD AT THE END OF DUE DILIGENCE.</w:t>
+      </w:r>
+      <w:r>
+        <w:rPr>
+          <w:color w:val="000000"/>
+          <w:sz w:val="22"/>
+          <w:szCs w:val="22"/>
+        </w:rPr>
+        <w:t xml:space="preserve"> Within five (5) business days </w:t>
+      </w:r>
+      <w:r>
+        <w:rPr>
+          <w:color w:val="000000"/>
+          <w:sz w:val="22"/>
+          <w:szCs w:val="22"/>
+        </w:rPr>
+        <w:t>following</w:t>
+      </w:r>
+      <w:r>
+        <w:rPr>
+          <w:color w:val="000000"/>
+          <w:sz w:val="22"/>
+          <w:szCs w:val="22"/>
+        </w:rPr>
+        <w:t xml:space="preserve"> mutual execution of </w:t>
+      </w:r>
+      <w:r>
+        <w:rPr>
+          <w:color w:val="000000"/>
+          <w:sz w:val="22"/>
+          <w:szCs w:val="22"/>
+        </w:rPr>
+        <w:t>the</w:t>
+      </w:r>
+      <w:r>
+        <w:rPr>
+          <w:color w:val="000000"/>
+          <w:sz w:val="22"/>
+          <w:szCs w:val="22"/>
+        </w:rPr>
+        <w:t xml:space="preserve"> Purchase Agreement</w:t>
+      </w:r>
+      <w:r>
+        <w:rPr>
+          <w:color w:val="000000"/>
+          <w:sz w:val="22"/>
+          <w:szCs w:val="22"/>
+        </w:rPr>
+        <w:t xml:space="preserve"> </w:t>
+      </w:r>
+      <w:r>
+        <w:rPr>
+          <w:sz w:val="22"/>
+          <w:szCs w:val="22"/>
+        </w:rPr>
+        <w:t>(as defined below)</w:t>
+      </w:r>
+      <w:r>
+        <w:rPr>
+          <w:color w:val="000000"/>
+          <w:sz w:val="22"/>
+          <w:szCs w:val="22"/>
+        </w:rPr>
+        <w:t xml:space="preserve">, </w:t>
+      </w:r>
+      <w:r>
+        <w:rPr>
+          <w:color w:val="000000"/>
+          <w:sz w:val="22"/>
+          <w:szCs w:val="22"/>
+        </w:rPr>
+        <w:t>[Ten Thousand and 00/100 Dollars ($10,000.00)] (</w:t>
+      </w:r>
+      <w:r>
+        <w:rPr>
+          <w:color w:val="000000"/>
+          <w:sz w:val="22"/>
+          <w:szCs w:val="22"/>
+        </w:rPr>
+        <w:t>“</w:t>
+      </w:r>
+      <w:r>
+        <w:rPr>
+          <w:b/>
+          <w:color w:val="000000"/>
+          <w:sz w:val="22"/>
+          <w:szCs w:val="22"/>
+        </w:rPr>
+        <w:t>Initial Deposit</w:t>
+      </w:r>
+      <w:r>
+        <w:rPr>
+          <w:color w:val="000000"/>
+          <w:sz w:val="22"/>
+          <w:szCs w:val="22"/>
+        </w:rPr>
+        <w:t xml:space="preserve">”) </w:t>
+      </w:r>
+      <w:r>
+        <w:rPr>
+          <w:color w:val="000000"/>
+          <w:sz w:val="22"/>
+          <w:szCs w:val="22"/>
+        </w:rPr>
+        <w:t>shall</w:t>
+      </w:r>
+      <w:r>
+        <w:rPr>
+          <w:color w:val="000000"/>
+          <w:sz w:val="22"/>
+          <w:szCs w:val="22"/>
+        </w:rPr>
+        <w:t xml:space="preserve"> be delivered to First American Title Insurance, National Commercial Services (“</w:t>
+      </w:r>
+      <w:r>
+        <w:rPr>
+          <w:b/>
+          <w:color w:val="000000"/>
+          <w:sz w:val="22"/>
+          <w:szCs w:val="22"/>
+        </w:rPr>
+        <w:t>Title Company</w:t>
+      </w:r>
+      <w:r>
+        <w:rPr>
+          <w:color w:val="000000"/>
+          <w:sz w:val="22"/>
+          <w:szCs w:val="22"/>
+        </w:rPr>
+        <w:t xml:space="preserve">”).  </w:t>
+      </w:r>
+      <w:r>
+        <w:rPr>
+          <w:sz w:val="22"/>
+          <w:szCs w:val="22"/>
+        </w:rPr>
+        <w:t xml:space="preserve">If, prior to the expiration of the Due Diligence Period (as defined below), Purchaser determines not to pursue the transaction, Purchaser may terminate the Purchase </w:t>
+      </w:r>
+      <w:r>
+        <w:rPr>
+          <w:sz w:val="22"/>
+          <w:szCs w:val="22"/>
+        </w:rPr>
+        <w:t>Agreement,</w:t>
+      </w:r>
+      <w:r>
+        <w:rPr>
+          <w:sz w:val="22"/>
+          <w:szCs w:val="22"/>
+        </w:rPr>
+        <w:t xml:space="preserve"> and the Initial Deposit shall be fully and promptly refunded to Purchaser. Otherwise,</w:t>
+      </w:r>
+      <w:r>
+        <w:rPr>
+          <w:sz w:val="22"/>
+          <w:szCs w:val="22"/>
+        </w:rPr>
+        <w:t xml:space="preserve"> upon waiver of the Due Diligence Period,</w:t>
+      </w:r>
+      <w:r>
+        <w:rPr>
+          <w:sz w:val="22"/>
+          <w:szCs w:val="22"/>
+        </w:rPr>
+        <w:t xml:space="preserve"> the Initial Deposit shall become non-refundable</w:t>
+      </w:r>
+      <w:r>
+        <w:rPr>
+          <w:sz w:val="22"/>
+          <w:szCs w:val="22"/>
+        </w:rPr>
+        <w:t xml:space="preserve"> to the Purchas</w:t>
+      </w:r>
+      <w:r>
+        <w:rPr>
+          <w:sz w:val="22"/>
+          <w:szCs w:val="22"/>
+        </w:rPr>
+        <w:t>er</w:t>
+      </w:r>
+      <w:r>
+        <w:rPr>
+          <w:sz w:val="22"/>
+          <w:szCs w:val="22"/>
+        </w:rPr>
+        <w:t xml:space="preserve">, </w:t>
+      </w:r>
+      <w:r>
+        <w:rPr>
+          <w:sz w:val="22"/>
+          <w:szCs w:val="22"/>
+        </w:rPr>
+        <w:lastRenderedPageBreak/>
+        <w:t>subject to (i) a default by Seller under the Purchase Agreement, or (ii) a casualty or a condemnation, each as shall be further defined in the Purchase Agreement</w:t>
+      </w:r>
+      <w:r>
+        <w:rPr>
+          <w:sz w:val="22"/>
+          <w:szCs w:val="22"/>
+        </w:rPr>
+        <w:t xml:space="preserve"> </w:t>
+      </w:r>
+      <w:r>
+        <w:rPr>
+          <w:sz w:val="22"/>
+          <w:szCs w:val="22"/>
+        </w:rPr>
+        <w:t>and Purchaser shall deposit an additional sum into escrow with the Title Company in the amount of [</w:t>
+      </w:r>
+      <w:r>
+        <w:rPr>
+          <w:sz w:val="22"/>
+          <w:szCs w:val="22"/>
+        </w:rPr>
+        <w:t xml:space="preserve">Ten </w:t>
+      </w:r>
+      <w:r>
+        <w:rPr>
+          <w:sz w:val="22"/>
+          <w:szCs w:val="22"/>
+        </w:rPr>
+        <w:t>Thousand and 00/100 Dollars ($</w:t>
+      </w:r>
+      <w:r>
+        <w:rPr>
+          <w:sz w:val="22"/>
+          <w:szCs w:val="22"/>
+        </w:rPr>
+        <w:t>10</w:t>
+      </w:r>
+      <w:r>
+        <w:rPr>
+          <w:sz w:val="22"/>
+          <w:szCs w:val="22"/>
+        </w:rPr>
+        <w:t>,000.00)] (“</w:t>
+      </w:r>
+      <w:r>
+        <w:rPr>
+          <w:b/>
+          <w:bCs/>
+          <w:sz w:val="22"/>
+          <w:szCs w:val="22"/>
+        </w:rPr>
+        <w:t>Additional Deposit</w:t>
+      </w:r>
+      <w:r>
+        <w:rPr>
+          <w:sz w:val="22"/>
+          <w:szCs w:val="22"/>
+        </w:rPr>
+        <w:t xml:space="preserve">”, which together with the Initial Deposit, </w:t>
+      </w:r>
+      <w:r>
+        <w:rPr>
+          <w:sz w:val="22"/>
+          <w:szCs w:val="22"/>
+        </w:rPr>
+        <w:t>is</w:t>
+      </w:r>
+      <w:r>
+        <w:rPr>
+          <w:sz w:val="22"/>
+          <w:szCs w:val="22"/>
+        </w:rPr>
+        <w:t xml:space="preserve"> referred to herein as the </w:t>
+      </w:r>
+      <w:r>
+        <w:rPr>
+          <w:sz w:val="22"/>
+          <w:szCs w:val="22"/>
+        </w:rPr>
         <w:t>(</w:t>
       </w:r>
-      <w:proofErr w:type="spellStart"/>
-      <w:r>
-        <w:rPr>
-          <w:sz w:val="22"/>
-          <w:szCs w:val="22"/>
-        </w:rPr>
-        <w:t>i</w:t>
-      </w:r>
-      <w:proofErr w:type="spellEnd"/>
-      <w:r>
-        <w:rPr>
-          <w:sz w:val="22"/>
-          <w:szCs w:val="22"/>
-        </w:rPr>
-        <w:t>) Purchaser’s receipt of Governmental Approvals</w:t>
+      <w:r>
+        <w:rPr>
+          <w:sz w:val="22"/>
+          <w:szCs w:val="22"/>
+        </w:rPr>
+        <w:t>“</w:t>
+      </w:r>
+      <w:r>
+        <w:rPr>
+          <w:b/>
+          <w:bCs/>
+          <w:sz w:val="22"/>
+          <w:szCs w:val="22"/>
+        </w:rPr>
+        <w:t>Earnest Money</w:t>
+      </w:r>
+      <w:r>
+        <w:rPr>
+          <w:sz w:val="22"/>
+          <w:szCs w:val="22"/>
+        </w:rPr>
+        <w:t xml:space="preserve">”). The Additional Deposit </w:t>
+      </w:r>
+      <w:bookmarkStart w:id="2" w:name="_Hlk195803284"/>
+      <w:r>
+        <w:rPr>
+          <w:sz w:val="22"/>
+          <w:szCs w:val="22"/>
+        </w:rPr>
+        <w:t>shall be non-</w:t>
+      </w:r>
+      <w:r>
+        <w:rPr>
+          <w:sz w:val="22"/>
+          <w:szCs w:val="22"/>
+        </w:rPr>
+        <w:t>refundable</w:t>
+      </w:r>
+      <w:r>
+        <w:rPr>
+          <w:sz w:val="22"/>
+          <w:szCs w:val="22"/>
+        </w:rPr>
+        <w:t xml:space="preserve"> </w:t>
+      </w:r>
+      <w:r>
+        <w:rPr>
+          <w:sz w:val="22"/>
+          <w:szCs w:val="22"/>
+        </w:rPr>
+        <w:t xml:space="preserve">to the Purchaser </w:t>
+      </w:r>
+      <w:r>
+        <w:rPr>
+          <w:sz w:val="22"/>
+          <w:szCs w:val="22"/>
+        </w:rPr>
+        <w:t>subject</w:t>
+      </w:r>
+      <w:r>
+        <w:rPr>
+          <w:sz w:val="22"/>
+          <w:szCs w:val="22"/>
+        </w:rPr>
+        <w:t xml:space="preserve"> to</w:t>
+      </w:r>
+      <w:r>
+        <w:rPr>
+          <w:sz w:val="22"/>
+          <w:szCs w:val="22"/>
+        </w:rPr>
+        <w:t xml:space="preserve"> (i)</w:t>
+      </w:r>
+      <w:r>
+        <w:rPr>
+          <w:sz w:val="22"/>
+          <w:szCs w:val="22"/>
+        </w:rPr>
+        <w:t xml:space="preserve"> Purchaser’s receipt of the Governmental Approvals during the Governmental Approvals Period (as defined belo</w:t>
+      </w:r>
+      <w:r>
+        <w:rPr>
+          <w:sz w:val="22"/>
+          <w:szCs w:val="22"/>
+        </w:rPr>
+        <w:t>w),</w:t>
+      </w:r>
+      <w:r>
+        <w:rPr>
+          <w:sz w:val="22"/>
+          <w:szCs w:val="22"/>
+        </w:rPr>
+        <w:t xml:space="preserve"> (ii)</w:t>
+      </w:r>
+      <w:r>
+        <w:rPr>
+          <w:sz w:val="22"/>
+          <w:szCs w:val="22"/>
+        </w:rPr>
+        <w:t xml:space="preserve"> a default by Seller under the Purchase Agreemen</w:t>
+      </w:r>
+      <w:r>
+        <w:rPr>
+          <w:sz w:val="22"/>
+          <w:szCs w:val="22"/>
+        </w:rPr>
+        <w:t>t</w:t>
       </w:r>
       <w:r>
         <w:rPr>
@@ -953,56 +1465,50 @@
           <w:sz w:val="22"/>
           <w:szCs w:val="22"/>
         </w:rPr>
-        <w:t xml:space="preserve"> during the Governmental Approvals Period (as defined below), (ii) a default by Seller under the Purchase Agreement</w:t>
-      </w:r>
-      <w:r>
-        <w:rPr>
-          <w:sz w:val="22"/>
-          <w:szCs w:val="22"/>
-        </w:rPr>
-        <w:t>,</w:t>
-      </w:r>
-      <w:r>
-        <w:rPr>
-          <w:sz w:val="22"/>
-          <w:szCs w:val="22"/>
-        </w:rPr>
-        <w:t xml:space="preserve"> or (iii) a casualty or a condemnation, each as shall be further defined in the Purchase Agreement.</w:t>
-      </w:r>
-      <w:r>
-        <w:rPr>
-          <w:sz w:val="22"/>
-          <w:szCs w:val="22"/>
-        </w:rPr>
-        <w:t xml:space="preserve"> </w:t>
-      </w:r>
-      <w:r>
-        <w:rPr>
-          <w:sz w:val="22"/>
-          <w:szCs w:val="22"/>
-        </w:rPr>
-        <w:t>If the</w:t>
-      </w:r>
-      <w:r>
-        <w:rPr>
-          <w:sz w:val="22"/>
-          <w:szCs w:val="22"/>
-        </w:rPr>
-        <w:t xml:space="preserve"> Purchaser has not obtained the Governmental Approvals during the Governmental Approvals Period, Purchaser may terminate the Purchase Agreement</w:t>
-      </w:r>
-      <w:r>
-        <w:rPr>
-          <w:sz w:val="22"/>
-          <w:szCs w:val="22"/>
-        </w:rPr>
-        <w:t>,</w:t>
-      </w:r>
-      <w:r>
-        <w:rPr>
-          <w:sz w:val="22"/>
-          <w:szCs w:val="22"/>
-        </w:rPr>
-        <w:t xml:space="preserve"> and the Earnest Money shall be fully and promptly refunded to Purchaser. Otherwise, the Earnest Money shall become non-refundable </w:t>
+        <w:t xml:space="preserve"> or (iii)</w:t>
+      </w:r>
+      <w:r>
+        <w:rPr>
+          <w:sz w:val="22"/>
+          <w:szCs w:val="22"/>
+        </w:rPr>
+        <w:t xml:space="preserve"> a casualty or a condemnation, each as shall be further de</w:t>
+      </w:r>
+      <w:r>
+        <w:rPr>
+          <w:sz w:val="22"/>
+          <w:szCs w:val="22"/>
+        </w:rPr>
+        <w:t>fined</w:t>
+      </w:r>
+      <w:r>
+        <w:rPr>
+          <w:sz w:val="22"/>
+          <w:szCs w:val="22"/>
+        </w:rPr>
+        <w:t xml:space="preserve"> in the Purchase Agreement.</w:t>
+      </w:r>
+      <w:bookmarkEnd w:id="2"/>
+      <w:r>
+        <w:rPr>
+          <w:sz w:val="22"/>
+          <w:szCs w:val="22"/>
+        </w:rPr>
+        <w:t xml:space="preserve"> If Purchaser has not obtained the Governmental Approvals during the Governmental Approvals Period, then Purchaser may terminate the Purchase </w:t>
+      </w:r>
+      <w:r>
+        <w:rPr>
+          <w:sz w:val="22"/>
+          <w:szCs w:val="22"/>
+        </w:rPr>
+        <w:t>Agreement,</w:t>
+      </w:r>
+      <w:r>
+        <w:rPr>
+          <w:sz w:val="22"/>
+          <w:szCs w:val="22"/>
+        </w:rPr>
+        <w:t xml:space="preserve"> and the Additional Deposit shall be fully and promptly refunded to Purchaser. Otherwise, the Additional Deposit shall become non-refundable </w:t>
       </w:r>
       <w:r>
         <w:rPr>
@@ -1033,7 +1539,7 @@
           <w:szCs w:val="22"/>
           <w:highlight w:val="yellow"/>
         </w:rPr>
-        <w:t xml:space="preserve"> REMOVE </w:t>
+        <w:t xml:space="preserve"> USE THE FOLLOWING </w:t>
       </w:r>
       <w:r>
         <w:rPr>
@@ -1042,7 +1548,7 @@
           <w:szCs w:val="22"/>
           <w:highlight w:val="yellow"/>
         </w:rPr>
-        <w:t xml:space="preserve">PARAGRAPH ABOVE </w:t>
+        <w:t xml:space="preserve">PARAGRAPH </w:t>
       </w:r>
       <w:r>
         <w:rPr>
@@ -1051,43 +1557,39 @@
           <w:szCs w:val="22"/>
           <w:highlight w:val="yellow"/>
         </w:rPr>
-        <w:t>AND USE THE FOLLOWING</w:t>
+        <w:t>IF MONEY IS GOING HARD MONTHLY AFTER DUE DILIGENCE</w:t>
       </w:r>
       <w:r>
         <w:rPr>
           <w:color w:val="000000"/>
           <w:sz w:val="22"/>
           <w:szCs w:val="22"/>
-          <w:highlight w:val="yellow"/>
-        </w:rPr>
-        <w:t xml:space="preserve"> PARAGRPAPH</w:t>
+        </w:rPr>
+        <w:t xml:space="preserve">. Within five (5) business days </w:t>
       </w:r>
       <w:r>
         <w:rPr>
           <w:color w:val="000000"/>
           <w:sz w:val="22"/>
           <w:szCs w:val="22"/>
-          <w:highlight w:val="yellow"/>
-        </w:rPr>
-        <w:t xml:space="preserve"> IF</w:t>
+        </w:rPr>
+        <w:t>following</w:t>
       </w:r>
       <w:r>
         <w:rPr>
           <w:color w:val="000000"/>
           <w:sz w:val="22"/>
           <w:szCs w:val="22"/>
-          <w:highlight w:val="yellow"/>
-        </w:rPr>
-        <w:t xml:space="preserve"> THE</w:t>
+        </w:rPr>
+        <w:t xml:space="preserve"> mutual execution of </w:t>
       </w:r>
       <w:r>
         <w:rPr>
           <w:color w:val="000000"/>
           <w:sz w:val="22"/>
           <w:szCs w:val="22"/>
-          <w:highlight w:val="yellow"/>
-        </w:rPr>
-        <w:t xml:space="preserve"> INITIAL DEPOSIT IS GOING HARD AT THE END OF DUE DILIGENCE.</w:t>
+        </w:rPr>
+        <w:t>the</w:t>
       </w:r>
       <w:r>
         <w:rPr>
@@ -1095,7 +1597,7 @@
           <w:sz w:val="22"/>
           <w:szCs w:val="22"/>
         </w:rPr>
-        <w:t xml:space="preserve"> Within five (5) business days </w:t>
+        <w:t xml:space="preserve"> Purch</w:t>
       </w:r>
       <w:r>
         <w:rPr>
@@ -1103,15 +1605,16 @@
           <w:sz w:val="22"/>
           <w:szCs w:val="22"/>
         </w:rPr>
-        <w:t>following</w:t>
-      </w:r>
-      <w:r>
-        <w:rPr>
+        <w:t>ase Agreement (as defined below), [Ten Thousand and 00/100 Dollars ($10,000.00)] (the “</w:t>
+      </w:r>
+      <w:r>
+        <w:rPr>
+          <w:b/>
           <w:color w:val="000000"/>
           <w:sz w:val="22"/>
           <w:szCs w:val="22"/>
         </w:rPr>
-        <w:t xml:space="preserve"> mutual execution of </w:t>
+        <w:t>Initial Deposit</w:t>
       </w:r>
       <w:r>
         <w:rPr>
@@ -1119,7 +1622,7 @@
           <w:sz w:val="22"/>
           <w:szCs w:val="22"/>
         </w:rPr>
-        <w:t>the</w:t>
+        <w:t xml:space="preserve">”) </w:t>
       </w:r>
       <w:r>
         <w:rPr>
@@ -1127,7 +1630,7 @@
           <w:sz w:val="22"/>
           <w:szCs w:val="22"/>
         </w:rPr>
-        <w:t xml:space="preserve"> Purchase Agreement</w:t>
+        <w:t>shall</w:t>
       </w:r>
       <w:r>
         <w:rPr>
@@ -1135,22 +1638,16 @@
           <w:sz w:val="22"/>
           <w:szCs w:val="22"/>
         </w:rPr>
-        <w:t xml:space="preserve"> </w:t>
-      </w:r>
-      <w:r>
-        <w:rPr>
-          <w:sz w:val="22"/>
-          <w:szCs w:val="22"/>
-        </w:rPr>
-        <w:t>(as defined below)</w:t>
-      </w:r>
-      <w:r>
-        <w:rPr>
+        <w:t xml:space="preserve"> be delivered to First American Title Insurance, National Commercial Services (the “</w:t>
+      </w:r>
+      <w:r>
+        <w:rPr>
+          <w:b/>
           <w:color w:val="000000"/>
           <w:sz w:val="22"/>
           <w:szCs w:val="22"/>
         </w:rPr>
-        <w:t xml:space="preserve">, </w:t>
+        <w:t>Title Company</w:t>
       </w:r>
       <w:r>
         <w:rPr>
@@ -1158,65 +1655,7 @@
           <w:sz w:val="22"/>
           <w:szCs w:val="22"/>
         </w:rPr>
-        <w:t>[Ten Thousand and 00/100 Dollars ($10,000.00)] (</w:t>
-      </w:r>
-      <w:r>
-        <w:rPr>
-          <w:color w:val="000000"/>
-          <w:sz w:val="22"/>
-          <w:szCs w:val="22"/>
-        </w:rPr>
-        <w:t>“</w:t>
-      </w:r>
-      <w:r>
-        <w:rPr>
-          <w:b/>
-          <w:color w:val="000000"/>
-          <w:sz w:val="22"/>
-          <w:szCs w:val="22"/>
-        </w:rPr>
-        <w:t>Initial Deposit</w:t>
-      </w:r>
-      <w:r>
-        <w:rPr>
-          <w:color w:val="000000"/>
-          <w:sz w:val="22"/>
-          <w:szCs w:val="22"/>
-        </w:rPr>
-        <w:t xml:space="preserve">”) </w:t>
-      </w:r>
-      <w:r>
-        <w:rPr>
-          <w:color w:val="000000"/>
-          <w:sz w:val="22"/>
-          <w:szCs w:val="22"/>
-        </w:rPr>
-        <w:t>shall</w:t>
-      </w:r>
-      <w:r>
-        <w:rPr>
-          <w:color w:val="000000"/>
-          <w:sz w:val="22"/>
-          <w:szCs w:val="22"/>
-        </w:rPr>
-        <w:t xml:space="preserve"> be delivered to First American Title Insurance, National Commercial Services (“</w:t>
-      </w:r>
-      <w:r>
-        <w:rPr>
-          <w:b/>
-          <w:color w:val="000000"/>
-          <w:sz w:val="22"/>
-          <w:szCs w:val="22"/>
-        </w:rPr>
-        <w:t>Title Company</w:t>
-      </w:r>
-      <w:r>
-        <w:rPr>
-          <w:color w:val="000000"/>
-          <w:sz w:val="22"/>
-          <w:szCs w:val="22"/>
-        </w:rPr>
-        <w:t xml:space="preserve">”).  </w:t>
+        <w:t xml:space="preserve">”). </w:t>
       </w:r>
       <w:r>
         <w:rPr>
@@ -1225,62 +1664,21 @@
         </w:rPr>
         <w:t xml:space="preserve">If, prior to the expiration of the Due Diligence Period (as defined below), Purchaser determines not to pursue the transaction, Purchaser may terminate the Purchase </w:t>
       </w:r>
-      <w:r>
-        <w:rPr>
-          <w:sz w:val="22"/>
-          <w:szCs w:val="22"/>
-        </w:rPr>
-        <w:t>Agreement,</w:t>
-      </w:r>
-      <w:r>
-        <w:rPr>
-          <w:sz w:val="22"/>
-          <w:szCs w:val="22"/>
-        </w:rPr>
-        <w:t xml:space="preserve"> and the Initial Deposit shall be fully and promptly refunded to Purchaser. Otherwise,</w:t>
-      </w:r>
-      <w:r>
-        <w:rPr>
-          <w:sz w:val="22"/>
-          <w:szCs w:val="22"/>
-        </w:rPr>
-        <w:t xml:space="preserve"> upon waiver of the Due Diligence Period,</w:t>
-      </w:r>
-      <w:r>
-        <w:rPr>
-          <w:sz w:val="22"/>
-          <w:szCs w:val="22"/>
-        </w:rPr>
-        <w:t xml:space="preserve"> the Initial Deposit shall become non-refundable</w:t>
-      </w:r>
-      <w:r>
-        <w:rPr>
-          <w:sz w:val="22"/>
-          <w:szCs w:val="22"/>
-        </w:rPr>
-        <w:t xml:space="preserve"> to the Purchas</w:t>
-      </w:r>
-      <w:r>
-        <w:rPr>
-          <w:sz w:val="22"/>
-          <w:szCs w:val="22"/>
-        </w:rPr>
-        <w:t>er</w:t>
-      </w:r>
-      <w:r>
-        <w:rPr>
-          <w:sz w:val="22"/>
-          <w:szCs w:val="22"/>
-        </w:rPr>
-        <w:t xml:space="preserve">, and </w:t>
-      </w:r>
-      <w:r>
-        <w:rPr>
-          <w:sz w:val="22"/>
-          <w:szCs w:val="22"/>
-        </w:rPr>
-        <w:lastRenderedPageBreak/>
-        <w:t>Purchaser shall deposit an additional sum into escrow with the Title Company in the amount of [</w:t>
+      <w:proofErr w:type="gramStart"/>
+      <w:r>
+        <w:rPr>
+          <w:sz w:val="22"/>
+          <w:szCs w:val="22"/>
+        </w:rPr>
+        <w:t>Agreement</w:t>
+      </w:r>
+      <w:proofErr w:type="gramEnd"/>
+      <w:r>
+        <w:rPr>
+          <w:sz w:val="22"/>
+          <w:szCs w:val="22"/>
+        </w:rPr>
+        <w:t xml:space="preserve"> and the Initial Deposit shall be fully and promptly refunded to Purchaser. Otherwise, Purchaser shall deposit an additional sum into escrow with the Title Company in the amount of [</w:t>
       </w:r>
       <w:r>
         <w:rPr>
@@ -1308,7 +1706,7 @@
           <w:sz w:val="22"/>
           <w:szCs w:val="22"/>
         </w:rPr>
-        <w:t>,000.00)] (“</w:t>
+        <w:t>,000.00)] (the “</w:t>
       </w:r>
       <w:r>
         <w:rPr>
@@ -1324,35 +1722,21 @@
           <w:sz w:val="22"/>
           <w:szCs w:val="22"/>
         </w:rPr>
-        <w:t xml:space="preserve">”, which together with the Initial Deposit, </w:t>
-      </w:r>
-      <w:r>
-        <w:rPr>
-          <w:sz w:val="22"/>
-          <w:szCs w:val="22"/>
-        </w:rPr>
-        <w:t>is</w:t>
-      </w:r>
-      <w:r>
-        <w:rPr>
-          <w:sz w:val="22"/>
-          <w:szCs w:val="22"/>
-        </w:rPr>
-        <w:t xml:space="preserve"> referred to herein as the </w:t>
-      </w:r>
-      <w:r>
-        <w:rPr>
-          <w:sz w:val="22"/>
-          <w:szCs w:val="22"/>
-        </w:rPr>
-        <w:t>(</w:t>
-      </w:r>
-      <w:r>
-        <w:rPr>
-          <w:sz w:val="22"/>
-          <w:szCs w:val="22"/>
-        </w:rPr>
-        <w:t>“</w:t>
+        <w:t>”, which together with the Initial Deposit,</w:t>
+      </w:r>
+      <w:r>
+        <w:rPr>
+          <w:sz w:val="22"/>
+          <w:szCs w:val="22"/>
+        </w:rPr>
+        <w:t xml:space="preserve"> is</w:t>
+      </w:r>
+      <w:r>
+        <w:rPr>
+          <w:sz w:val="22"/>
+          <w:szCs w:val="22"/>
+        </w:rPr>
+        <w:t xml:space="preserve"> referred to herein as the “</w:t>
       </w:r>
       <w:r>
         <w:rPr>
@@ -1368,408 +1752,6 @@
           <w:sz w:val="22"/>
           <w:szCs w:val="22"/>
         </w:rPr>
-        <w:t xml:space="preserve">”). The Additional Deposit </w:t>
-      </w:r>
-      <w:bookmarkStart w:id="2" w:name="_Hlk195803284"/>
-      <w:r>
-        <w:rPr>
-          <w:sz w:val="22"/>
-          <w:szCs w:val="22"/>
-        </w:rPr>
-        <w:t>shall be non-</w:t>
-      </w:r>
-      <w:r>
-        <w:rPr>
-          <w:sz w:val="22"/>
-          <w:szCs w:val="22"/>
-        </w:rPr>
-        <w:t>refundable</w:t>
-      </w:r>
-      <w:r>
-        <w:rPr>
-          <w:sz w:val="22"/>
-          <w:szCs w:val="22"/>
-        </w:rPr>
-        <w:t xml:space="preserve"> </w:t>
-      </w:r>
-      <w:r>
-        <w:rPr>
-          <w:sz w:val="22"/>
-          <w:szCs w:val="22"/>
-        </w:rPr>
-        <w:t xml:space="preserve">to the Purchaser </w:t>
-      </w:r>
-      <w:r>
-        <w:rPr>
-          <w:sz w:val="22"/>
-          <w:szCs w:val="22"/>
-        </w:rPr>
-        <w:t>subject</w:t>
-      </w:r>
-      <w:r>
-        <w:rPr>
-          <w:sz w:val="22"/>
-          <w:szCs w:val="22"/>
-        </w:rPr>
-        <w:t xml:space="preserve"> to</w:t>
-      </w:r>
-      <w:r>
-        <w:rPr>
-          <w:sz w:val="22"/>
-          <w:szCs w:val="22"/>
-        </w:rPr>
-        <w:t xml:space="preserve"> (</w:t>
-      </w:r>
-      <w:proofErr w:type="spellStart"/>
-      <w:r>
-        <w:rPr>
-          <w:sz w:val="22"/>
-          <w:szCs w:val="22"/>
-        </w:rPr>
-        <w:t>i</w:t>
-      </w:r>
-      <w:proofErr w:type="spellEnd"/>
-      <w:r>
-        <w:rPr>
-          <w:sz w:val="22"/>
-          <w:szCs w:val="22"/>
-        </w:rPr>
-        <w:t>)</w:t>
-      </w:r>
-      <w:r>
-        <w:rPr>
-          <w:sz w:val="22"/>
-          <w:szCs w:val="22"/>
-        </w:rPr>
-        <w:t xml:space="preserve"> Purchaser’s receipt of the Governmental Approvals during the Governmental Approvals Period (as defined belo</w:t>
-      </w:r>
-      <w:r>
-        <w:rPr>
-          <w:sz w:val="22"/>
-          <w:szCs w:val="22"/>
-        </w:rPr>
-        <w:t>w),</w:t>
-      </w:r>
-      <w:r>
-        <w:rPr>
-          <w:sz w:val="22"/>
-          <w:szCs w:val="22"/>
-        </w:rPr>
-        <w:t xml:space="preserve"> (ii)</w:t>
-      </w:r>
-      <w:r>
-        <w:rPr>
-          <w:sz w:val="22"/>
-          <w:szCs w:val="22"/>
-        </w:rPr>
-        <w:t xml:space="preserve"> a default by Seller under the Purchase Agreemen</w:t>
-      </w:r>
-      <w:r>
-        <w:rPr>
-          <w:sz w:val="22"/>
-          <w:szCs w:val="22"/>
-        </w:rPr>
-        <w:t>t</w:t>
-      </w:r>
-      <w:r>
-        <w:rPr>
-          <w:sz w:val="22"/>
-          <w:szCs w:val="22"/>
-        </w:rPr>
-        <w:t>,</w:t>
-      </w:r>
-      <w:r>
-        <w:rPr>
-          <w:sz w:val="22"/>
-          <w:szCs w:val="22"/>
-        </w:rPr>
-        <w:t xml:space="preserve"> or (iii)</w:t>
-      </w:r>
-      <w:r>
-        <w:rPr>
-          <w:sz w:val="22"/>
-          <w:szCs w:val="22"/>
-        </w:rPr>
-        <w:t xml:space="preserve"> a casualty or a condemnation, each as shall be further de</w:t>
-      </w:r>
-      <w:r>
-        <w:rPr>
-          <w:sz w:val="22"/>
-          <w:szCs w:val="22"/>
-        </w:rPr>
-        <w:t>fined</w:t>
-      </w:r>
-      <w:r>
-        <w:rPr>
-          <w:sz w:val="22"/>
-          <w:szCs w:val="22"/>
-        </w:rPr>
-        <w:t xml:space="preserve"> in the Purchase Agreement.</w:t>
-      </w:r>
-      <w:bookmarkEnd w:id="2"/>
-      <w:r>
-        <w:rPr>
-          <w:sz w:val="22"/>
-          <w:szCs w:val="22"/>
-        </w:rPr>
-        <w:t xml:space="preserve"> If Purchaser has not obtained the Governmental Approvals during the Governmental Approvals Period, then Purchaser may terminate the Purchase </w:t>
-      </w:r>
-      <w:r>
-        <w:rPr>
-          <w:sz w:val="22"/>
-          <w:szCs w:val="22"/>
-        </w:rPr>
-        <w:t>Agreement,</w:t>
-      </w:r>
-      <w:r>
-        <w:rPr>
-          <w:sz w:val="22"/>
-          <w:szCs w:val="22"/>
-        </w:rPr>
-        <w:t xml:space="preserve"> and the Additional Deposit shall be fully and promptly refunded to Purchaser. Otherwise, the Additional Deposit shall become non-refundable </w:t>
-      </w:r>
-      <w:r>
-        <w:rPr>
-          <w:sz w:val="22"/>
-          <w:szCs w:val="22"/>
-        </w:rPr>
-        <w:t xml:space="preserve">to the Purchaser </w:t>
-      </w:r>
-      <w:r>
-        <w:rPr>
-          <w:sz w:val="22"/>
-          <w:szCs w:val="22"/>
-        </w:rPr>
-        <w:t>upon expiration of the Governmental Approvals Period (except as expressly set forth in the Purchase Agreement).  The Earnest Money shall</w:t>
-      </w:r>
-      <w:r>
-        <w:rPr>
-          <w:color w:val="000000"/>
-          <w:sz w:val="22"/>
-          <w:szCs w:val="22"/>
-        </w:rPr>
-        <w:t xml:space="preserve"> be applied towards the Purchase Price at Closing.</w:t>
-      </w:r>
-      <w:r>
-        <w:rPr>
-          <w:color w:val="000000"/>
-          <w:sz w:val="22"/>
-          <w:szCs w:val="22"/>
-          <w:highlight w:val="yellow"/>
-        </w:rPr>
-        <w:t xml:space="preserve"> USE THE FOLLOWING </w:t>
-      </w:r>
-      <w:r>
-        <w:rPr>
-          <w:color w:val="000000"/>
-          <w:sz w:val="22"/>
-          <w:szCs w:val="22"/>
-          <w:highlight w:val="yellow"/>
-        </w:rPr>
-        <w:t xml:space="preserve">PARAGRAPH </w:t>
-      </w:r>
-      <w:r>
-        <w:rPr>
-          <w:color w:val="000000"/>
-          <w:sz w:val="22"/>
-          <w:szCs w:val="22"/>
-          <w:highlight w:val="yellow"/>
-        </w:rPr>
-        <w:t>IF MONEY IS GOING HARD MONTHLY AFTER DUE DILIGENCE</w:t>
-      </w:r>
-      <w:r>
-        <w:rPr>
-          <w:color w:val="000000"/>
-          <w:sz w:val="22"/>
-          <w:szCs w:val="22"/>
-        </w:rPr>
-        <w:t xml:space="preserve">. Within five (5) business days </w:t>
-      </w:r>
-      <w:r>
-        <w:rPr>
-          <w:color w:val="000000"/>
-          <w:sz w:val="22"/>
-          <w:szCs w:val="22"/>
-        </w:rPr>
-        <w:t>following</w:t>
-      </w:r>
-      <w:r>
-        <w:rPr>
-          <w:color w:val="000000"/>
-          <w:sz w:val="22"/>
-          <w:szCs w:val="22"/>
-        </w:rPr>
-        <w:t xml:space="preserve"> mutual execution of </w:t>
-      </w:r>
-      <w:r>
-        <w:rPr>
-          <w:color w:val="000000"/>
-          <w:sz w:val="22"/>
-          <w:szCs w:val="22"/>
-        </w:rPr>
-        <w:t>the</w:t>
-      </w:r>
-      <w:r>
-        <w:rPr>
-          <w:color w:val="000000"/>
-          <w:sz w:val="22"/>
-          <w:szCs w:val="22"/>
-        </w:rPr>
-        <w:t xml:space="preserve"> Purch</w:t>
-      </w:r>
-      <w:r>
-        <w:rPr>
-          <w:color w:val="000000"/>
-          <w:sz w:val="22"/>
-          <w:szCs w:val="22"/>
-        </w:rPr>
-        <w:t>ase Agreement (as defined below), [Ten Thousand and 00/100 Dollars ($10,000.00)] (the “</w:t>
-      </w:r>
-      <w:r>
-        <w:rPr>
-          <w:b/>
-          <w:color w:val="000000"/>
-          <w:sz w:val="22"/>
-          <w:szCs w:val="22"/>
-        </w:rPr>
-        <w:t>Initial Deposit</w:t>
-      </w:r>
-      <w:r>
-        <w:rPr>
-          <w:color w:val="000000"/>
-          <w:sz w:val="22"/>
-          <w:szCs w:val="22"/>
-        </w:rPr>
-        <w:t xml:space="preserve">”) </w:t>
-      </w:r>
-      <w:r>
-        <w:rPr>
-          <w:color w:val="000000"/>
-          <w:sz w:val="22"/>
-          <w:szCs w:val="22"/>
-        </w:rPr>
-        <w:t>shall</w:t>
-      </w:r>
-      <w:r>
-        <w:rPr>
-          <w:color w:val="000000"/>
-          <w:sz w:val="22"/>
-          <w:szCs w:val="22"/>
-        </w:rPr>
-        <w:t xml:space="preserve"> be delivered to First American Title Insurance, National Commercial Services (the “</w:t>
-      </w:r>
-      <w:r>
-        <w:rPr>
-          <w:b/>
-          <w:color w:val="000000"/>
-          <w:sz w:val="22"/>
-          <w:szCs w:val="22"/>
-        </w:rPr>
-        <w:t>Title Company</w:t>
-      </w:r>
-      <w:r>
-        <w:rPr>
-          <w:color w:val="000000"/>
-          <w:sz w:val="22"/>
-          <w:szCs w:val="22"/>
-        </w:rPr>
-        <w:t xml:space="preserve">”). </w:t>
-      </w:r>
-      <w:r>
-        <w:rPr>
-          <w:sz w:val="22"/>
-          <w:szCs w:val="22"/>
-        </w:rPr>
-        <w:t xml:space="preserve">If, prior to the expiration of the Due Diligence Period (as defined below), Purchaser determines not to pursue the transaction, Purchaser may terminate the Purchase </w:t>
-      </w:r>
-      <w:proofErr w:type="gramStart"/>
-      <w:r>
-        <w:rPr>
-          <w:sz w:val="22"/>
-          <w:szCs w:val="22"/>
-        </w:rPr>
-        <w:t>Agreement</w:t>
-      </w:r>
-      <w:proofErr w:type="gramEnd"/>
-      <w:r>
-        <w:rPr>
-          <w:sz w:val="22"/>
-          <w:szCs w:val="22"/>
-        </w:rPr>
-        <w:t xml:space="preserve"> and the Initial Deposit shall be fully and promptly refunded to Purchaser. Otherwise, Purchaser shall deposit an additional sum into escrow with the Title Company in the amount of [</w:t>
-      </w:r>
-      <w:r>
-        <w:rPr>
-          <w:sz w:val="22"/>
-          <w:szCs w:val="22"/>
-        </w:rPr>
-        <w:t xml:space="preserve">Ten </w:t>
-      </w:r>
-      <w:r>
-        <w:rPr>
-          <w:sz w:val="22"/>
-          <w:szCs w:val="22"/>
-        </w:rPr>
-        <w:t>Thousand and 00/100 Dollars ($</w:t>
-      </w:r>
-      <w:r>
-        <w:rPr>
-          <w:sz w:val="22"/>
-          <w:szCs w:val="22"/>
-        </w:rPr>
-        <w:t>10</w:t>
-      </w:r>
-      <w:r>
-        <w:rPr>
-          <w:sz w:val="22"/>
-          <w:szCs w:val="22"/>
-        </w:rPr>
-        <w:t>,000.00)] (the “</w:t>
-      </w:r>
-      <w:r>
-        <w:rPr>
-          <w:b/>
-          <w:bCs/>
-          <w:sz w:val="22"/>
-          <w:szCs w:val="22"/>
-        </w:rPr>
-        <w:t>Additional Deposit</w:t>
-      </w:r>
-      <w:r>
-        <w:rPr>
-          <w:sz w:val="22"/>
-          <w:szCs w:val="22"/>
-        </w:rPr>
-        <w:t>”, which together with the Initial Deposit,</w:t>
-      </w:r>
-      <w:r>
-        <w:rPr>
-          <w:sz w:val="22"/>
-          <w:szCs w:val="22"/>
-        </w:rPr>
-        <w:t xml:space="preserve"> is</w:t>
-      </w:r>
-      <w:r>
-        <w:rPr>
-          <w:sz w:val="22"/>
-          <w:szCs w:val="22"/>
-        </w:rPr>
-        <w:t xml:space="preserve"> referred to herein as the “</w:t>
-      </w:r>
-      <w:r>
-        <w:rPr>
-          <w:b/>
-          <w:bCs/>
-          <w:sz w:val="22"/>
-          <w:szCs w:val="22"/>
-        </w:rPr>
-        <w:t>Earnest Money</w:t>
-      </w:r>
-      <w:r>
-        <w:rPr>
-          <w:sz w:val="22"/>
-          <w:szCs w:val="22"/>
-        </w:rPr>
         <w:t xml:space="preserve">”) and </w:t>
       </w:r>
       <w:r>
@@ -1791,23 +1773,7 @@
           <w:sz w:val="22"/>
           <w:szCs w:val="22"/>
         </w:rPr>
-        <w:t>subject to (</w:t>
-      </w:r>
-      <w:proofErr w:type="spellStart"/>
-      <w:r>
-        <w:rPr>
-          <w:sz w:val="22"/>
-          <w:szCs w:val="22"/>
-        </w:rPr>
-        <w:t>i</w:t>
-      </w:r>
-      <w:proofErr w:type="spellEnd"/>
-      <w:r>
-        <w:rPr>
-          <w:sz w:val="22"/>
-          <w:szCs w:val="22"/>
-        </w:rPr>
-        <w:t>) Purchaser’s receipt of the Governmental Approvals during the Governmental Approvals Period (as defined below), (ii) a default by Seller under the Purchase Agreement</w:t>
+        <w:t>subject to (i) Purchaser’s receipt of the Governmental Approvals during the Governmental Approvals Period (as defined below), (ii) a default by Seller under the Purchase Agreement</w:t>
       </w:r>
       <w:r>
         <w:rPr>
@@ -2012,9 +1978,8 @@
     </w:p>
     <w:p>
       <w:pPr>
-        <w:pStyle w:val="BodyText"/>
-        <w:ind w:firstLine="0"/>
-        <w:jc w:val="both"/>
+        <w:pStyle w:val="StandardL1"/>
+        <w:ind w:left="0" w:firstLine="720"/>
         <w:rPr>
           <w:sz w:val="22"/>
           <w:szCs w:val="22"/>
@@ -2023,48 +1988,30 @@
       </w:pPr>
       <w:r>
         <w:rPr>
-          <w:sz w:val="22"/>
-          <w:szCs w:val="22"/>
-          <w:highlight w:val="yellow"/>
-        </w:rPr>
-        <w:t>INSERT THIS PARAGRA</w:t>
-      </w:r>
-      <w:r>
-        <w:rPr>
-          <w:sz w:val="22"/>
-          <w:szCs w:val="22"/>
-          <w:highlight w:val="yellow"/>
-        </w:rPr>
-        <w:t>P</w:t>
-      </w:r>
-      <w:r>
-        <w:rPr>
-          <w:sz w:val="22"/>
-          <w:szCs w:val="22"/>
-          <w:highlight w:val="yellow"/>
-        </w:rPr>
-        <w:t xml:space="preserve">H IF WE ARE </w:t>
-      </w:r>
-      <w:r>
-        <w:rPr>
-          <w:sz w:val="22"/>
-          <w:szCs w:val="22"/>
+          <w:highlight w:val="yellow"/>
+        </w:rPr>
+        <w:t>REMOVE UNLESS WE ARE</w:t>
+      </w:r>
+      <w:r>
+        <w:rPr>
+          <w:highlight w:val="yellow"/>
+        </w:rPr>
+        <w:t xml:space="preserve"> </w:t>
+      </w:r>
+      <w:r>
+        <w:rPr>
           <w:highlight w:val="yellow"/>
         </w:rPr>
         <w:t>PAYING</w:t>
       </w:r>
       <w:r>
         <w:rPr>
-          <w:sz w:val="22"/>
-          <w:szCs w:val="22"/>
           <w:highlight w:val="yellow"/>
         </w:rPr>
         <w:t xml:space="preserve"> </w:t>
       </w:r>
       <w:r>
         <w:rPr>
-          <w:sz w:val="22"/>
-          <w:szCs w:val="22"/>
           <w:highlight w:val="yellow"/>
         </w:rPr>
         <w:t xml:space="preserve">A LEGAL REIMBURSEMENT FEE AT PSA EXECUTION </w:t>
@@ -4201,11 +4148,39 @@
     <w:p>
       <w:pPr>
         <w:pStyle w:val="StandardL1"/>
-        <w:numPr>
-          <w:ilvl w:val="0"/>
-          <w:numId w:val="0"/>
-        </w:numPr>
-        <w:ind w:firstLine="990"/>
+        <w:ind w:left="0" w:firstLine="990"/>
+      </w:pPr>
+      <w:r>
+        <w:rPr>
+          <w:highlight w:val="yellow"/>
+        </w:rPr>
+        <w:t>REMOVE UNLESS</w:t>
+      </w:r>
+      <w:r>
+        <w:rPr>
+          <w:highlight w:val="yellow"/>
+        </w:rPr>
+        <w:t xml:space="preserve"> </w:t>
+      </w:r>
+      <w:r>
+        <w:rPr>
+          <w:highlight w:val="yellow"/>
+        </w:rPr>
+        <w:t xml:space="preserve">WE ARE ALLOWING </w:t>
+      </w:r>
+      <w:r>
+        <w:rPr>
+          <w:highlight w:val="yellow"/>
+        </w:rPr>
+        <w:t xml:space="preserve">THE </w:t>
+      </w:r>
+      <w:r>
+        <w:rPr>
+          <w:highlight w:val="yellow"/>
+        </w:rPr>
+        <w:t>SELLER TO CONTRIBUTE LAND AND RECEIVE LP LEVEL RETURNS</w:t>
+      </w:r>
+      <w:r>
         <w:rPr>
           <w:b/>
           <w:bCs/>
@@ -4214,90 +4189,7 @@
           <w:highlight w:val="yellow"/>
           <w:u w:val="single"/>
         </w:rPr>
-      </w:pPr>
-      <w:r>
-        <w:rPr>
-          <w:sz w:val="22"/>
-          <w:szCs w:val="22"/>
-          <w:highlight w:val="yellow"/>
-        </w:rPr>
-        <w:t xml:space="preserve">INSERT </w:t>
-      </w:r>
-      <w:r>
-        <w:rPr>
-          <w:sz w:val="22"/>
-          <w:szCs w:val="22"/>
-          <w:highlight w:val="yellow"/>
-        </w:rPr>
-        <w:t xml:space="preserve">THIS PARAGRAGH </w:t>
-      </w:r>
-      <w:r>
-        <w:rPr>
-          <w:sz w:val="22"/>
-          <w:szCs w:val="22"/>
-          <w:highlight w:val="yellow"/>
-        </w:rPr>
-        <w:t xml:space="preserve">IF </w:t>
-      </w:r>
-      <w:r>
-        <w:rPr>
-          <w:sz w:val="22"/>
-          <w:szCs w:val="22"/>
-          <w:highlight w:val="yellow"/>
-        </w:rPr>
-        <w:t xml:space="preserve">WE ARE ALLOWING </w:t>
-      </w:r>
-      <w:r>
-        <w:rPr>
-          <w:sz w:val="22"/>
-          <w:szCs w:val="22"/>
-          <w:highlight w:val="yellow"/>
-        </w:rPr>
-        <w:t xml:space="preserve">THE </w:t>
-      </w:r>
-      <w:r>
-        <w:rPr>
-          <w:sz w:val="22"/>
-          <w:szCs w:val="22"/>
-          <w:highlight w:val="yellow"/>
-        </w:rPr>
-        <w:t>SELLER TO CONTRIBUTE LAND AND RECEIVE LP LEVEL RETURNS</w:t>
-      </w:r>
-      <w:r>
-        <w:rPr>
-          <w:b/>
-          <w:bCs/>
-          <w:sz w:val="22"/>
-          <w:szCs w:val="22"/>
-          <w:highlight w:val="yellow"/>
-          <w:u w:val="single"/>
-        </w:rPr>
-        <w:t xml:space="preserve"> </w:t>
-      </w:r>
-    </w:p>
-    <w:p>
-      <w:pPr>
-        <w:pStyle w:val="StandardL1"/>
-        <w:numPr>
-          <w:ilvl w:val="0"/>
-          <w:numId w:val="0"/>
-        </w:numPr>
-        <w:ind w:firstLine="990"/>
-        <w:rPr>
-          <w:sz w:val="22"/>
-          <w:szCs w:val="22"/>
-        </w:rPr>
-      </w:pPr>
-      <w:r>
-        <w:rPr>
-          <w:b/>
-          <w:bCs/>
-          <w:sz w:val="22"/>
-          <w:szCs w:val="22"/>
-          <w:highlight w:val="yellow"/>
-          <w:u w:val="single"/>
-        </w:rPr>
-        <w:t>Seller</w:t>
+        <w:t xml:space="preserve"> Seller</w:t>
       </w:r>
       <w:r>
         <w:rPr>
@@ -5941,7 +5833,7 @@
       <mc:AlternateContent>
         <mc:Choice Requires="wps">
           <w:drawing>
-            <wp:anchor distT="0" distB="0" distL="114300" distR="114300" simplePos="0" relativeHeight="251657216" behindDoc="0" locked="0" layoutInCell="1" allowOverlap="1" wp14:anchorId="4E3A3174" wp14:editId="05CFFBAD">
+            <wp:anchor distT="0" distB="0" distL="114300" distR="114300" simplePos="0" relativeHeight="251657216" behindDoc="0" locked="0" layoutInCell="1" allowOverlap="1" wp14:anchorId="7B90545B" wp14:editId="4BA3ABE1">
               <wp:simplePos x="0" y="0"/>
               <wp:positionH relativeFrom="column">
                 <wp:posOffset>3823970</wp:posOffset>
@@ -5952,7 +5844,7 @@
               <wp:extent cx="2597150" cy="703580"/>
               <wp:effectExtent l="4445" t="3810" r="0" b="0"/>
               <wp:wrapNone/>
-              <wp:docPr id="1220096682" name="Text Box 4"/>
+              <wp:docPr id="1236385353" name="Text Box 4"/>
               <wp:cNvGraphicFramePr>
                 <a:graphicFrameLocks xmlns:a="http://schemas.openxmlformats.org/drawingml/2006/main"/>
               </wp:cNvGraphicFramePr>
@@ -6070,7 +5962,7 @@
         </mc:Choice>
         <mc:Fallback>
           <w:pict>
-            <v:shapetype w14:anchorId="4E3A3174" id="_x0000_t202" coordsize="21600,21600" o:spt="202" path="m,l,21600r21600,l21600,xe">
+            <v:shapetype w14:anchorId="7B90545B" id="_x0000_t202" coordsize="21600,21600" o:spt="202" path="m,l,21600r21600,l21600,xe">
               <v:stroke joinstyle="miter"/>
               <v:path gradientshapeok="t" o:connecttype="rect"/>
             </v:shapetype>
@@ -6149,8 +6041,8 @@
         <w:noProof/>
       </w:rPr>
       <w:drawing>
-        <wp:inline distT="0" distB="0" distL="0" distR="0" wp14:anchorId="29880EFA" wp14:editId="38A90F25">
-          <wp:extent cx="1238250" cy="514350"/>
+        <wp:inline distT="0" distB="0" distL="0" distR="0" wp14:anchorId="6B012FF3" wp14:editId="799C24CF">
+          <wp:extent cx="1231900" cy="514350"/>
           <wp:effectExtent l="0" t="0" r="0" b="0"/>
           <wp:docPr id="1" name="Picture 1"/>
           <wp:cNvGraphicFramePr>
@@ -6181,7 +6073,7 @@
                 <pic:spPr bwMode="auto">
                   <a:xfrm>
                     <a:off x="0" y="0"/>
-                    <a:ext cx="1238250" cy="514350"/>
+                    <a:ext cx="1231900" cy="514350"/>
                   </a:xfrm>
                   <a:prstGeom prst="rect">
                     <a:avLst/>
@@ -6215,7 +6107,7 @@
       <mc:AlternateContent>
         <mc:Choice Requires="wps">
           <w:drawing>
-            <wp:anchor distT="0" distB="0" distL="114300" distR="114300" simplePos="0" relativeHeight="251658240" behindDoc="0" locked="0" layoutInCell="1" allowOverlap="1" wp14:anchorId="63B34C82" wp14:editId="1A1F49FE">
+            <wp:anchor distT="0" distB="0" distL="114300" distR="114300" simplePos="0" relativeHeight="251658240" behindDoc="0" locked="0" layoutInCell="1" allowOverlap="1" wp14:anchorId="27997816" wp14:editId="0EBA93DE">
               <wp:simplePos x="0" y="0"/>
               <wp:positionH relativeFrom="column">
                 <wp:posOffset>15875</wp:posOffset>
@@ -6226,7 +6118,7 @@
               <wp:extent cx="5991860" cy="0"/>
               <wp:effectExtent l="6350" t="12065" r="12065" b="6985"/>
               <wp:wrapNone/>
-              <wp:docPr id="1157735304" name="Straight Arrow Connector 2"/>
+              <wp:docPr id="833240158" name="Straight Arrow Connector 2"/>
               <wp:cNvGraphicFramePr>
                 <a:graphicFrameLocks xmlns:a="http://schemas.openxmlformats.org/drawingml/2006/main"/>
               </wp:cNvGraphicFramePr>
@@ -6276,7 +6168,7 @@
         </mc:Choice>
         <mc:Fallback>
           <w:pict>
-            <v:shapetype w14:anchorId="2D985C9B" id="_x0000_t32" coordsize="21600,21600" o:spt="32" o:oned="t" path="m,l21600,21600e" filled="f">
+            <v:shapetype w14:anchorId="2E959C7D" id="_x0000_t32" coordsize="21600,21600" o:spt="32" o:oned="t" path="m,l21600,21600e" filled="f">
               <v:path arrowok="t" fillok="f" o:connecttype="none"/>
               <o:lock v:ext="edit" shapetype="t"/>
             </v:shapetype>
@@ -6607,16 +6499,16 @@
       </w:rPr>
     </w:lvl>
   </w:abstractNum>
-  <w:num w:numId="1" w16cid:durableId="792016145">
+  <w:num w:numId="1" w16cid:durableId="1716735310">
     <w:abstractNumId w:val="1"/>
   </w:num>
-  <w:num w:numId="2" w16cid:durableId="378945272">
+  <w:num w:numId="2" w16cid:durableId="2134597113">
     <w:abstractNumId w:val="1"/>
   </w:num>
-  <w:num w:numId="3" w16cid:durableId="1773355519">
+  <w:num w:numId="3" w16cid:durableId="1417047984">
     <w:abstractNumId w:val="1"/>
   </w:num>
-  <w:num w:numId="4" w16cid:durableId="202837810">
+  <w:num w:numId="4" w16cid:durableId="1920872037">
     <w:abstractNumId w:val="0"/>
     <w:lvlOverride w:ilvl="0">
       <w:startOverride w:val="1"/>
@@ -6646,10 +6538,10 @@
       <w:startOverride w:val="1"/>
     </w:lvlOverride>
   </w:num>
-  <w:num w:numId="5" w16cid:durableId="910192556">
+  <w:num w:numId="5" w16cid:durableId="577442829">
     <w:abstractNumId w:val="0"/>
   </w:num>
-  <w:num w:numId="6" w16cid:durableId="1695957418">
+  <w:num w:numId="6" w16cid:durableId="1982728047">
     <w:abstractNumId w:val="1"/>
     <w:lvlOverride w:ilvl="0">
       <w:startOverride w:val="1"/>
@@ -6679,37 +6571,37 @@
       <w:startOverride w:val="1"/>
     </w:lvlOverride>
   </w:num>
-  <w:num w:numId="7" w16cid:durableId="1218394025">
+  <w:num w:numId="7" w16cid:durableId="1511261893">
     <w:abstractNumId w:val="1"/>
   </w:num>
-  <w:num w:numId="8" w16cid:durableId="70323655">
+  <w:num w:numId="8" w16cid:durableId="1494106543">
     <w:abstractNumId w:val="1"/>
   </w:num>
-  <w:num w:numId="9" w16cid:durableId="1348948278">
+  <w:num w:numId="9" w16cid:durableId="697925460">
     <w:abstractNumId w:val="1"/>
   </w:num>
-  <w:num w:numId="10" w16cid:durableId="1324971693">
+  <w:num w:numId="10" w16cid:durableId="2081443366">
     <w:abstractNumId w:val="1"/>
   </w:num>
-  <w:num w:numId="11" w16cid:durableId="232938011">
+  <w:num w:numId="11" w16cid:durableId="1155756323">
     <w:abstractNumId w:val="1"/>
   </w:num>
-  <w:num w:numId="12" w16cid:durableId="2071414923">
+  <w:num w:numId="12" w16cid:durableId="322438080">
     <w:abstractNumId w:val="1"/>
   </w:num>
-  <w:num w:numId="13" w16cid:durableId="1224485645">
+  <w:num w:numId="13" w16cid:durableId="483862791">
     <w:abstractNumId w:val="1"/>
   </w:num>
-  <w:num w:numId="14" w16cid:durableId="1089695540">
+  <w:num w:numId="14" w16cid:durableId="511454631">
     <w:abstractNumId w:val="1"/>
   </w:num>
-  <w:num w:numId="15" w16cid:durableId="1896774742">
+  <w:num w:numId="15" w16cid:durableId="470948505">
     <w:abstractNumId w:val="1"/>
   </w:num>
-  <w:num w:numId="16" w16cid:durableId="994452057">
+  <w:num w:numId="16" w16cid:durableId="363486115">
     <w:abstractNumId w:val="1"/>
   </w:num>
-  <w:num w:numId="17" w16cid:durableId="1521507846">
+  <w:num w:numId="17" w16cid:durableId="968432987">
     <w:abstractNumId w:val="1"/>
   </w:num>
 </w:numbering>
@@ -7272,15 +7164,13 @@
   </w:style>
   <w:style w:type="character" w:default="1" w:styleId="DefaultParagraphFont">
     <w:name w:val="Default Paragraph Font"/>
-    <w:uiPriority w:val="1"/>
     <w:semiHidden/>
-    <w:unhideWhenUsed/>
+    <w:rsid w:val="00BA0D86"/>
   </w:style>
   <w:style w:type="table" w:default="1" w:styleId="TableNormal">
     <w:name w:val="Normal Table"/>
-    <w:uiPriority w:val="99"/>
     <w:semiHidden/>
-    <w:unhideWhenUsed/>
+    <w:rsid w:val="00BA0D86"/>
     <w:tblPr>
       <w:tblInd w:w="0" w:type="dxa"/>
       <w:tblCellMar>
@@ -7293,9 +7183,8 @@
   </w:style>
   <w:style w:type="numbering" w:default="1" w:styleId="NoList">
     <w:name w:val="No List"/>
-    <w:uiPriority w:val="99"/>
     <w:semiHidden/>
-    <w:unhideWhenUsed/>
+    <w:rsid w:val="00BA0D86"/>
   </w:style>
   <w:style w:type="paragraph" w:styleId="BodyText">
     <w:name w:val="Body Text"/>
@@ -7985,6 +7874,10 @@
 </file>
 
 <file path=customXml/item1.xml><?xml version="1.0" encoding="utf-8"?>
+<LongProperties xmlns="http://schemas.microsoft.com/office/2006/metadata/longProperties"/>
+</file>
+
+<file path=customXml/item2.xml><?xml version="1.0" encoding="utf-8"?>
 <?mso-contentType ?>
 <FormTemplates xmlns="http://schemas.microsoft.com/sharepoint/v3/contenttype/forms">
   <Display>DocumentLibraryForm</Display>
@@ -7993,9 +7886,9 @@
 </FormTemplates>
 </file>
 
-<file path=customXml/item2.xml><?xml version="1.0" encoding="utf-8"?>
-<ct:contentTypeSchema xmlns:ct="http://schemas.microsoft.com/office/2006/metadata/contentType" xmlns:ma="http://schemas.microsoft.com/office/2006/metadata/properties/metaAttributes" ct:_="" ma:_="" ma:contentTypeName="Document" ma:contentTypeID="0x0101004A6F54FAD2137C4D9DF78C8843874E3C" ma:contentTypeVersion="20" ma:contentTypeDescription="Create a new document." ma:contentTypeScope="" ma:versionID="5c78336efc91a96d5c4d6ec8b99a1182">
-  <xsd:schema xmlns:xsd="http://www.w3.org/2001/XMLSchema" xmlns:xs="http://www.w3.org/2001/XMLSchema" xmlns:p="http://schemas.microsoft.com/office/2006/metadata/properties" xmlns:ns2="23e146b3-f3f7-43ef-8902-31a1419272e5" xmlns:ns3="00b5ac78-2362-4493-8056-2401df405323" targetNamespace="http://schemas.microsoft.com/office/2006/metadata/properties" ma:root="true" ma:fieldsID="a5f46392e85981625a937ef86ff1fadb" ns2:_="" ns3:_="">
+<file path=customXml/item3.xml><?xml version="1.0" encoding="utf-8"?>
+<ct:contentTypeSchema xmlns:ct="http://schemas.microsoft.com/office/2006/metadata/contentType" xmlns:ma="http://schemas.microsoft.com/office/2006/metadata/properties/metaAttributes" ct:_="" ma:_="" ma:contentTypeName="Document" ma:contentTypeID="0x0101004A6F54FAD2137C4D9DF78C8843874E3C" ma:contentTypeVersion="20" ma:contentTypeDescription="Create a new document." ma:contentTypeScope="" ma:versionID="df4a0a2a1008266f80eb555ed4a3ddfd">
+  <xsd:schema xmlns:xsd="http://www.w3.org/2001/XMLSchema" xmlns:xs="http://www.w3.org/2001/XMLSchema" xmlns:p="http://schemas.microsoft.com/office/2006/metadata/properties" xmlns:ns2="23e146b3-f3f7-43ef-8902-31a1419272e5" xmlns:ns3="00b5ac78-2362-4493-8056-2401df405323" targetNamespace="http://schemas.microsoft.com/office/2006/metadata/properties" ma:root="true" ma:fieldsID="7847f7b7031d3c9d64bc293c8cfb8f73" ns2:_="" ns3:_="">
     <xsd:import namespace="23e146b3-f3f7-43ef-8902-31a1419272e5"/>
     <xsd:import namespace="00b5ac78-2362-4493-8056-2401df405323"/>
     <xsd:element name="properties">
@@ -8267,7 +8160,7 @@
 </ct:contentTypeSchema>
 </file>
 
-<file path=customXml/item3.xml><?xml version="1.0" encoding="utf-8"?>
+<file path=customXml/item4.xml><?xml version="1.0" encoding="utf-8"?>
 <p:properties xmlns:p="http://schemas.microsoft.com/office/2006/metadata/properties" xmlns:xsi="http://www.w3.org/2001/XMLSchema-instance" xmlns:pc="http://schemas.microsoft.com/office/infopath/2007/PartnerControls">
   <documentManagement>
     <lcf76f155ced4ddcb4097134ff3c332f xmlns="23e146b3-f3f7-43ef-8902-31a1419272e5">
@@ -8282,20 +8175,24 @@
 </p:properties>
 </file>
 
-<file path=customXml/item4.xml><?xml version="1.0" encoding="utf-8"?>
-<LongProperties xmlns="http://schemas.microsoft.com/office/2006/metadata/longProperties"/>
+<file path=customXml/itemProps1.xml><?xml version="1.0" encoding="utf-8"?>
+<ds:datastoreItem xmlns:ds="http://schemas.openxmlformats.org/officeDocument/2006/customXml" ds:itemID="{D14E77A5-7CE9-4938-BF1A-28D6FE1E15CA}">
+  <ds:schemaRefs>
+    <ds:schemaRef ds:uri="http://schemas.microsoft.com/office/2006/metadata/longProperties"/>
+  </ds:schemaRefs>
+</ds:datastoreItem>
 </file>
 
-<file path=customXml/itemProps1.xml><?xml version="1.0" encoding="utf-8"?>
-<ds:datastoreItem xmlns:ds="http://schemas.openxmlformats.org/officeDocument/2006/customXml" ds:itemID="{870376F7-0B6D-40C0-A5CF-B068169D7101}">
+<file path=customXml/itemProps2.xml><?xml version="1.0" encoding="utf-8"?>
+<ds:datastoreItem xmlns:ds="http://schemas.openxmlformats.org/officeDocument/2006/customXml" ds:itemID="{992BE9F8-B173-4C3E-8FD1-C29A5D387F07}">
   <ds:schemaRefs>
     <ds:schemaRef ds:uri="http://schemas.microsoft.com/sharepoint/v3/contenttype/forms"/>
   </ds:schemaRefs>
 </ds:datastoreItem>
 </file>
 
-<file path=customXml/itemProps2.xml><?xml version="1.0" encoding="utf-8"?>
-<ds:datastoreItem xmlns:ds="http://schemas.openxmlformats.org/officeDocument/2006/customXml" ds:itemID="{786DF23E-A9FB-4807-B87E-ED769DC1CB65}">
+<file path=customXml/itemProps3.xml><?xml version="1.0" encoding="utf-8"?>
+<ds:datastoreItem xmlns:ds="http://schemas.openxmlformats.org/officeDocument/2006/customXml" ds:itemID="{380D44E9-DDAD-4D75-B967-9B88BFBFED87}">
   <ds:schemaRefs>
     <ds:schemaRef ds:uri="http://schemas.microsoft.com/office/2006/metadata/contentType"/>
     <ds:schemaRef ds:uri="http://schemas.microsoft.com/office/2006/metadata/properties/metaAttributes"/>
@@ -8313,8 +8210,8 @@
 </ds:datastoreItem>
 </file>
 
-<file path=customXml/itemProps3.xml><?xml version="1.0" encoding="utf-8"?>
-<ds:datastoreItem xmlns:ds="http://schemas.openxmlformats.org/officeDocument/2006/customXml" ds:itemID="{1D1610B8-73E3-420F-8012-44A5C87745AF}">
+<file path=customXml/itemProps4.xml><?xml version="1.0" encoding="utf-8"?>
+<ds:datastoreItem xmlns:ds="http://schemas.openxmlformats.org/officeDocument/2006/customXml" ds:itemID="{72957DDB-1E03-42E8-872C-E3912DCF5D82}">
   <ds:schemaRefs>
     <ds:schemaRef ds:uri="http://schemas.microsoft.com/office/2006/metadata/properties"/>
     <ds:schemaRef ds:uri="http://schemas.microsoft.com/office/infopath/2007/PartnerControls"/>
@@ -8322,12 +8219,4 @@
     <ds:schemaRef ds:uri="00b5ac78-2362-4493-8056-2401df405323"/>
   </ds:schemaRefs>
 </ds:datastoreItem>
-</file>
-
-<file path=customXml/itemProps4.xml><?xml version="1.0" encoding="utf-8"?>
-<ds:datastoreItem xmlns:ds="http://schemas.openxmlformats.org/officeDocument/2006/customXml" ds:itemID="{0D6CFFF2-989C-497B-AC36-F31689D09125}">
-  <ds:schemaRefs>
-    <ds:schemaRef ds:uri="http://schemas.microsoft.com/office/2006/metadata/longProperties"/>
-  </ds:schemaRefs>
-</ds:datastoreItem>
 </file>
</xml_diff>

<commit_message>
Update LOI template (20260407 RB): remove "further defined" clause from DD Going Hard, add casualty/condemnation to Monthly Releases
- DD Going Hard: removed ", each as shall be further defined in the Purchase Agreement" from both Initial Deposit and Additional Deposit non-refundable sentences
- Monthly Going Hard: added "(i)" numbering and "or (ii) a casualty or a condemnation" to Monthly Releases refundability conditions
- Updated UI preview text in app.py and comparison test to match
- Added template/ folder with dated source templates (20260325, 20260407)

Co-Authored-By: Claude Opus 4.6 (1M context) <noreply@anthropic.com>
</commit_message>
<xml_diff>
--- a/Templates/LOI_Template.docx
+++ b/Templates/LOI_Template.docx
@@ -1263,8 +1263,7 @@
           <w:sz w:val="22"/>
           <w:szCs w:val="22"/>
         </w:rPr>
-        <w:lastRenderedPageBreak/>
-        <w:t>subject to (i) a default by Seller under the Purchase Agreement, or (ii) a casualty or a condemnation, each as shall be further defined in the Purchase Agreement</w:t>
+        <w:t>subject to (i) a default by Seller under the Purchase Agreement, or (ii) a casualty or a condemnation.</w:t>
       </w:r>
       <w:r>
         <w:rPr>
@@ -1278,7 +1277,7 @@
           <w:sz w:val="22"/>
           <w:szCs w:val="22"/>
         </w:rPr>
-        <w:t>and Purchaser shall deposit an additional sum into escrow with the Title Company in the amount of [</w:t>
+        <w:t>Purchaser shall deposit an additional sum into escrow with the Title Company in the amount of [</w:t>
       </w:r>
       <w:r>
         <w:rPr>
@@ -1472,21 +1471,19 @@
           <w:sz w:val="22"/>
           <w:szCs w:val="22"/>
         </w:rPr>
-        <w:t xml:space="preserve"> a casualty or a condemnation, each as shall be further de</w:t>
-      </w:r>
-      <w:r>
-        <w:rPr>
-          <w:sz w:val="22"/>
-          <w:szCs w:val="22"/>
-        </w:rPr>
-        <w:t>fined</w:t>
-      </w:r>
-      <w:r>
-        <w:rPr>
-          <w:sz w:val="22"/>
-          <w:szCs w:val="22"/>
-        </w:rPr>
-        <w:t xml:space="preserve"> in the Purchase Agreement.</w:t>
+        <w:t xml:space="preserve"> a casualty or a condemnation.</w:t>
+      </w:r>
+      <w:r>
+        <w:rPr>
+          <w:sz w:val="22"/>
+          <w:szCs w:val="22"/>
+        </w:rPr>
+      </w:r>
+      <w:r>
+        <w:rPr>
+          <w:sz w:val="22"/>
+          <w:szCs w:val="22"/>
+        </w:rPr>
       </w:r>
       <w:bookmarkEnd w:id="2"/>
       <w:r>
@@ -1787,7 +1784,7 @@
           <w:sz w:val="22"/>
           <w:szCs w:val="22"/>
         </w:rPr>
-        <w:t xml:space="preserve"> or (iii) a casualty or a condemnation, each as shall be further defined in the Purchase Agreement.</w:t>
+        <w:t xml:space="preserve"> or (iii) a casualty or a condemnation.</w:t>
       </w:r>
       <w:r>
         <w:rPr>
@@ -1895,7 +1892,7 @@
           <w:sz w:val="22"/>
           <w:szCs w:val="22"/>
         </w:rPr>
-        <w:t>, subject to a default by Seller under the Purchase Agreement,</w:t>
+        <w:t>, subject to (i) a default by Seller under the Purchase Agreement, or (ii) a casualty or a condemnation,</w:t>
       </w:r>
       <w:r>
         <w:rPr>

</xml_diff>

<commit_message>
Update LOI template (20260414 RB): restore "further defined" to DD/Monthly, add "of Initial Deposit" to legal reimb, SVP title
Template changes:
- DD Going Hard: restore "each as shall be further defined in the Purchase Agreement" and merge into single sentence
- Monthly Going Hard: add "each as shall be further defined in the Purchase Agreement" to (iii) clause
- Legal Reimbursement: add "of the Initial Deposit" before release language
- Richard Birner title: "Vice President" → "SVP"

Bug fix:
- Fix deleted paragraphs consuming section letters (A, B, C...) by setting numId=0 on deleted StandardL1 paragraphs

Tests:
- Add comprehensive formatting test suite (175 tests across all scenario combinations)
- Update UI vs doc comparison and template verbiage tests for new wording

Co-Authored-By: Claude Opus 4.6 (1M context) <noreply@anthropic.com>
</commit_message>
<xml_diff>
--- a/Templates/LOI_Template.docx
+++ b/Templates/LOI_Template.docx
@@ -32,21 +32,12 @@
           <w:szCs w:val="22"/>
         </w:rPr>
       </w:pPr>
-      <w:proofErr w:type="gramStart"/>
-      <w:r>
-        <w:rPr>
-          <w:sz w:val="22"/>
-          <w:szCs w:val="22"/>
-        </w:rPr>
-        <w:t>[___</w:t>
-      </w:r>
-      <w:proofErr w:type="gramEnd"/>
-      <w:r>
-        <w:rPr>
-          <w:sz w:val="22"/>
-          <w:szCs w:val="22"/>
-        </w:rPr>
-        <w:t>_________________]</w:t>
+      <w:r>
+        <w:rPr>
+          <w:sz w:val="22"/>
+          <w:szCs w:val="22"/>
+        </w:rPr>
+        <w:t>[____________________]</w:t>
       </w:r>
     </w:p>
     <w:p>
@@ -56,21 +47,12 @@
           <w:szCs w:val="22"/>
         </w:rPr>
       </w:pPr>
-      <w:proofErr w:type="gramStart"/>
-      <w:r>
-        <w:rPr>
-          <w:sz w:val="22"/>
-          <w:szCs w:val="22"/>
-        </w:rPr>
-        <w:t>[___</w:t>
-      </w:r>
-      <w:proofErr w:type="gramEnd"/>
-      <w:r>
-        <w:rPr>
-          <w:sz w:val="22"/>
-          <w:szCs w:val="22"/>
-        </w:rPr>
-        <w:t>_________________]</w:t>
+      <w:r>
+        <w:rPr>
+          <w:sz w:val="22"/>
+          <w:szCs w:val="22"/>
+        </w:rPr>
+        <w:t>[____________________]</w:t>
       </w:r>
     </w:p>
     <w:p>
@@ -80,21 +62,12 @@
           <w:szCs w:val="22"/>
         </w:rPr>
       </w:pPr>
-      <w:proofErr w:type="gramStart"/>
-      <w:r>
-        <w:rPr>
-          <w:sz w:val="22"/>
-          <w:szCs w:val="22"/>
-        </w:rPr>
-        <w:t>[___</w:t>
-      </w:r>
-      <w:proofErr w:type="gramEnd"/>
-      <w:r>
-        <w:rPr>
-          <w:sz w:val="22"/>
-          <w:szCs w:val="22"/>
-        </w:rPr>
-        <w:t>_________________]</w:t>
+      <w:r>
+        <w:rPr>
+          <w:sz w:val="22"/>
+          <w:szCs w:val="22"/>
+        </w:rPr>
+        <w:t>[____________________]</w:t>
       </w:r>
     </w:p>
     <w:p>
@@ -118,7 +91,6 @@
         </w:rPr>
         <w:t>ttn</w:t>
       </w:r>
-      <w:proofErr w:type="gramStart"/>
       <w:r>
         <w:rPr>
           <w:sz w:val="22"/>
@@ -138,15 +110,7 @@
           <w:sz w:val="22"/>
           <w:szCs w:val="22"/>
         </w:rPr>
-        <w:t>[__</w:t>
-      </w:r>
-      <w:proofErr w:type="gramEnd"/>
-      <w:r>
-        <w:rPr>
-          <w:sz w:val="22"/>
-          <w:szCs w:val="22"/>
-        </w:rPr>
-        <w:t>_____________]</w:t>
+        <w:t>[_______________]</w:t>
       </w:r>
     </w:p>
     <w:p>
@@ -294,30 +258,14 @@
           <w:sz w:val="22"/>
           <w:szCs w:val="22"/>
         </w:rPr>
-        <w:t>Mr./Mrs./</w:t>
-      </w:r>
-      <w:proofErr w:type="gramStart"/>
-      <w:r>
-        <w:rPr>
-          <w:sz w:val="22"/>
-          <w:szCs w:val="22"/>
-        </w:rPr>
-        <w:t>Ms.</w:t>
-      </w:r>
-      <w:r>
-        <w:rPr>
-          <w:sz w:val="22"/>
-          <w:szCs w:val="22"/>
-        </w:rPr>
-        <w:t>__</w:t>
-      </w:r>
-      <w:proofErr w:type="gramEnd"/>
-      <w:r>
-        <w:rPr>
-          <w:sz w:val="22"/>
-          <w:szCs w:val="22"/>
-        </w:rPr>
-        <w:t>_______]:</w:t>
+        <w:t>Mr./Mrs./Ms.</w:t>
+      </w:r>
+      <w:r>
+        <w:rPr>
+          <w:sz w:val="22"/>
+          <w:szCs w:val="22"/>
+        </w:rPr>
+        <w:t>_________]:</w:t>
       </w:r>
     </w:p>
     <w:p>
@@ -511,23 +459,7 @@
           <w:sz w:val="22"/>
           <w:szCs w:val="22"/>
         </w:rPr>
-        <w:t xml:space="preserve">operty is legally described and generally depicted </w:t>
-      </w:r>
-      <w:proofErr w:type="gramStart"/>
-      <w:r>
-        <w:rPr>
-          <w:sz w:val="22"/>
-          <w:szCs w:val="22"/>
-        </w:rPr>
-        <w:t>on</w:t>
-      </w:r>
-      <w:proofErr w:type="gramEnd"/>
-      <w:r>
-        <w:rPr>
-          <w:sz w:val="22"/>
-          <w:szCs w:val="22"/>
-        </w:rPr>
-        <w:t xml:space="preserve"> </w:t>
+        <w:t xml:space="preserve">operty is legally described and generally depicted on </w:t>
       </w:r>
       <w:r>
         <w:rPr>
@@ -1235,7 +1167,15 @@
           <w:sz w:val="22"/>
           <w:szCs w:val="22"/>
         </w:rPr>
-        <w:t xml:space="preserve"> the Initial Deposit shall become non-refundable</w:t>
+        <w:t xml:space="preserve"> the Initial Deposit shall become non-</w:t>
+      </w:r>
+      <w:r>
+        <w:rPr>
+          <w:sz w:val="22"/>
+          <w:szCs w:val="22"/>
+        </w:rPr>
+        <w:lastRenderedPageBreak/>
+        <w:t>refundable</w:t>
       </w:r>
       <w:r>
         <w:rPr>
@@ -1263,7 +1203,7 @@
           <w:sz w:val="22"/>
           <w:szCs w:val="22"/>
         </w:rPr>
-        <w:t>subject to (i) a default by Seller under the Purchase Agreement, or (ii) a casualty or a condemnation.</w:t>
+        <w:t>subject to (i) a default by Seller under the Purchase Agreement, or (ii) a casualty or a condemnation, each as shall be further defined in the Purchase Agreement</w:t>
       </w:r>
       <w:r>
         <w:rPr>
@@ -1277,7 +1217,7 @@
           <w:sz w:val="22"/>
           <w:szCs w:val="22"/>
         </w:rPr>
-        <w:t>Purchaser shall deposit an additional sum into escrow with the Title Company in the amount of [</w:t>
+        <w:t>and Purchaser shall deposit an additional sum into escrow with the Title Company in the amount of [</w:t>
       </w:r>
       <w:r>
         <w:rPr>
@@ -1473,18 +1413,6 @@
         </w:rPr>
         <w:t xml:space="preserve"> a casualty or a condemnation.</w:t>
       </w:r>
-      <w:r>
-        <w:rPr>
-          <w:sz w:val="22"/>
-          <w:szCs w:val="22"/>
-        </w:rPr>
-      </w:r>
-      <w:r>
-        <w:rPr>
-          <w:sz w:val="22"/>
-          <w:szCs w:val="22"/>
-        </w:rPr>
-      </w:r>
       <w:bookmarkEnd w:id="2"/>
       <w:r>
         <w:rPr>
@@ -1659,23 +1587,7 @@
           <w:sz w:val="22"/>
           <w:szCs w:val="22"/>
         </w:rPr>
-        <w:t xml:space="preserve">If, prior to the expiration of the Due Diligence Period (as defined below), Purchaser determines not to pursue the transaction, Purchaser may terminate the Purchase </w:t>
-      </w:r>
-      <w:proofErr w:type="gramStart"/>
-      <w:r>
-        <w:rPr>
-          <w:sz w:val="22"/>
-          <w:szCs w:val="22"/>
-        </w:rPr>
-        <w:t>Agreement</w:t>
-      </w:r>
-      <w:proofErr w:type="gramEnd"/>
-      <w:r>
-        <w:rPr>
-          <w:sz w:val="22"/>
-          <w:szCs w:val="22"/>
-        </w:rPr>
-        <w:t xml:space="preserve"> and the Initial Deposit shall be fully and promptly refunded to Purchaser. Otherwise, Purchaser shall deposit an additional sum into escrow with the Title Company in the amount of [</w:t>
+        <w:t>If, prior to the expiration of the Due Diligence Period (as defined below), Purchaser determines not to pursue the transaction, Purchaser may terminate the Purchase Agreement and the Initial Deposit shall be fully and promptly refunded to Purchaser. Otherwise, Purchaser shall deposit an additional sum into escrow with the Title Company in the amount of [</w:t>
       </w:r>
       <w:r>
         <w:rPr>
@@ -1784,7 +1696,7 @@
           <w:sz w:val="22"/>
           <w:szCs w:val="22"/>
         </w:rPr>
-        <w:t xml:space="preserve"> or (iii) a casualty or a condemnation.</w:t>
+        <w:t xml:space="preserve"> or (iii) a casualty or a condemnation, each as shall be further defined in the Purchase Agreement.</w:t>
       </w:r>
       <w:r>
         <w:rPr>
@@ -1892,14 +1804,28 @@
           <w:sz w:val="22"/>
           <w:szCs w:val="22"/>
         </w:rPr>
-        <w:t>, subject to (i) a default by Seller under the Purchase Agreement, or (ii) a casualty or a condemnation,</w:t>
-      </w:r>
-      <w:r>
-        <w:rPr>
-          <w:sz w:val="22"/>
-          <w:szCs w:val="22"/>
-        </w:rPr>
-        <w:t xml:space="preserve">  and </w:t>
+        <w:t xml:space="preserve">, subject to </w:t>
+      </w:r>
+      <w:r>
+        <w:rPr>
+          <w:sz w:val="22"/>
+          <w:szCs w:val="22"/>
+        </w:rPr>
+        <w:t>(i) a default by Seller under the Purchase Agreement, or (ii) a casualty or a condemnation</w:t>
+      </w:r>
+      <w:r>
+        <w:rPr>
+          <w:sz w:val="22"/>
+          <w:szCs w:val="22"/>
+        </w:rPr>
+        <w:t>,</w:t>
+      </w:r>
+      <w:r>
+        <w:rPr>
+          <w:sz w:val="22"/>
+          <w:szCs w:val="22"/>
+        </w:rPr>
+        <w:t xml:space="preserve"> and </w:t>
       </w:r>
       <w:r>
         <w:rPr>
@@ -2064,7 +1990,25 @@
           <w:szCs w:val="22"/>
           <w:highlight w:val="yellow"/>
         </w:rPr>
-        <w:t>[Five Thousand and 00/100 Dollars ($5,000.00)] shall be immediately released to the Seller by the Title Company (“</w:t>
+        <w:t xml:space="preserve">[Five Thousand and 00/100 Dollars ($5,000.00)] </w:t>
+      </w:r>
+      <w:r>
+        <w:rPr>
+          <w:color w:val="000000"/>
+          <w:sz w:val="22"/>
+          <w:szCs w:val="22"/>
+          <w:highlight w:val="yellow"/>
+        </w:rPr>
+        <w:t xml:space="preserve">of the Initial Deposit </w:t>
+      </w:r>
+      <w:r>
+        <w:rPr>
+          <w:color w:val="000000"/>
+          <w:sz w:val="22"/>
+          <w:szCs w:val="22"/>
+          <w:highlight w:val="yellow"/>
+        </w:rPr>
+        <w:t>shall be immediately released to the Seller by the Title Company (“</w:t>
       </w:r>
       <w:r>
         <w:rPr>
@@ -2282,7 +2226,15 @@
           <w:sz w:val="22"/>
           <w:szCs w:val="22"/>
         </w:rPr>
-        <w:t>Seller shall (a) not negotiate with any other party or sell or lease, offer to sell or lease, accept an offer to purchase or lease or solicit or respond to solicitations for the sale or lease of any portion of or interest in the Property, (b) not execute any contracts, leases, easements or other documents or grant any rights to or affecting the Property or take any other material actions affecting the Property without Purchaser’s prior written consent, and (c) continue to manage and maintain the Property as it is currently being managed and maintained.</w:t>
+        <w:t xml:space="preserve">Seller shall (a) not negotiate with any other party or sell or lease, offer to sell or lease, accept an offer to purchase or lease or solicit or respond to solicitations for the sale or lease of any portion of or interest in the Property, (b) not execute any contracts, leases, easements or other documents or grant any rights to or affecting the Property or take </w:t>
+      </w:r>
+      <w:r>
+        <w:rPr>
+          <w:sz w:val="22"/>
+          <w:szCs w:val="22"/>
+        </w:rPr>
+        <w:lastRenderedPageBreak/>
+        <w:t>any other material actions affecting the Property without Purchaser’s prior written consent, and (c) continue to manage and maintain the Property as it is currently being managed and maintained.</w:t>
       </w:r>
     </w:p>
     <w:p>
@@ -2301,7 +2253,6 @@
           <w:szCs w:val="22"/>
           <w:u w:val="single"/>
         </w:rPr>
-        <w:lastRenderedPageBreak/>
         <w:t>Due Diligence</w:t>
       </w:r>
       <w:r>
@@ -3754,7 +3705,16 @@
           <w:szCs w:val="22"/>
           <w:highlight w:val="yellow"/>
         </w:rPr>
-        <w:t>AND USE THE FOLLOWING IF BEING DELIVERD VACANT</w:t>
+        <w:t xml:space="preserve">AND USE </w:t>
+      </w:r>
+      <w:r>
+        <w:rPr>
+          <w:sz w:val="22"/>
+          <w:szCs w:val="22"/>
+          <w:highlight w:val="yellow"/>
+        </w:rPr>
+        <w:lastRenderedPageBreak/>
+        <w:t>THE FOLLOWING IF BEING DELIVERD VACANT</w:t>
       </w:r>
       <w:r>
         <w:rPr>
@@ -3803,15 +3763,7 @@
           <w:sz w:val="22"/>
           <w:szCs w:val="22"/>
         </w:rPr>
-        <w:t xml:space="preserve"> leases. If any tenant asserts a claims </w:t>
-      </w:r>
-      <w:r>
-        <w:rPr>
-          <w:sz w:val="22"/>
-          <w:szCs w:val="22"/>
-        </w:rPr>
-        <w:lastRenderedPageBreak/>
-        <w:t>or files a lawsuit against the Property</w:t>
+        <w:t xml:space="preserve"> leases. If any tenant asserts a claims or files a lawsuit against the Property</w:t>
       </w:r>
       <w:r>
         <w:rPr>
@@ -4345,25 +4297,7 @@
           <w:szCs w:val="22"/>
           <w:highlight w:val="yellow"/>
         </w:rPr>
-        <w:t xml:space="preserve">”). For </w:t>
-      </w:r>
-      <w:proofErr w:type="gramStart"/>
-      <w:r>
-        <w:rPr>
-          <w:sz w:val="22"/>
-          <w:szCs w:val="22"/>
-          <w:highlight w:val="yellow"/>
-        </w:rPr>
-        <w:t>the avoidance</w:t>
-      </w:r>
-      <w:proofErr w:type="gramEnd"/>
-      <w:r>
-        <w:rPr>
-          <w:sz w:val="22"/>
-          <w:szCs w:val="22"/>
-          <w:highlight w:val="yellow"/>
-        </w:rPr>
-        <w:t xml:space="preserve"> of doubt, the Seller shall not participate in any fees payable to Purchaser or its affiliates that are approved by the Capital Partner or Project’s lender.</w:t>
+        <w:t>”). For the avoidance of doubt, the Seller shall not participate in any fees payable to Purchaser or its affiliates that are approved by the Capital Partner or Project’s lender.</w:t>
       </w:r>
     </w:p>
     <w:bookmarkEnd w:id="6"/>
@@ -4390,23 +4324,7 @@
           <w:sz w:val="22"/>
           <w:szCs w:val="22"/>
         </w:rPr>
-        <w:t xml:space="preserve">.  During the Exclusivity Period </w:t>
-      </w:r>
-      <w:proofErr w:type="gramStart"/>
-      <w:r>
-        <w:rPr>
-          <w:sz w:val="22"/>
-          <w:szCs w:val="22"/>
-        </w:rPr>
-        <w:t>and,</w:t>
-      </w:r>
-      <w:proofErr w:type="gramEnd"/>
-      <w:r>
-        <w:rPr>
-          <w:sz w:val="22"/>
-          <w:szCs w:val="22"/>
-        </w:rPr>
-        <w:t xml:space="preserve"> </w:t>
+        <w:t xml:space="preserve">.  During the Exclusivity Period and, </w:t>
       </w:r>
       <w:r>
         <w:rPr>
@@ -4578,23 +4496,7 @@
           <w:sz w:val="22"/>
           <w:szCs w:val="22"/>
         </w:rPr>
-        <w:t xml:space="preserve">may be signed </w:t>
-      </w:r>
-      <w:proofErr w:type="gramStart"/>
-      <w:r>
-        <w:rPr>
-          <w:sz w:val="22"/>
-          <w:szCs w:val="22"/>
-        </w:rPr>
-        <w:t>in</w:t>
-      </w:r>
-      <w:proofErr w:type="gramEnd"/>
-      <w:r>
-        <w:rPr>
-          <w:sz w:val="22"/>
-          <w:szCs w:val="22"/>
-        </w:rPr>
-        <w:t xml:space="preserve"> counterparts with the same effect as if </w:t>
+        <w:t xml:space="preserve">may be signed in counterparts with the same effect as if </w:t>
       </w:r>
       <w:r>
         <w:rPr>
@@ -4749,6 +4651,7 @@
           <w:sz w:val="22"/>
           <w:szCs w:val="22"/>
         </w:rPr>
+        <w:lastRenderedPageBreak/>
         <w:t>Sincerely,</w:t>
       </w:r>
     </w:p>
@@ -4856,7 +4759,14 @@
           <w:sz w:val="22"/>
           <w:szCs w:val="22"/>
         </w:rPr>
-        <w:t xml:space="preserve">Vice President of </w:t>
+        <w:t>SVP</w:t>
+      </w:r>
+      <w:r>
+        <w:rPr>
+          <w:sz w:val="22"/>
+          <w:szCs w:val="22"/>
+        </w:rPr>
+        <w:t xml:space="preserve"> of </w:t>
       </w:r>
       <w:r>
         <w:rPr>
@@ -5830,7 +5740,7 @@
       <mc:AlternateContent>
         <mc:Choice Requires="wps">
           <w:drawing>
-            <wp:anchor distT="0" distB="0" distL="114300" distR="114300" simplePos="0" relativeHeight="251657216" behindDoc="0" locked="0" layoutInCell="1" allowOverlap="1" wp14:anchorId="7B90545B" wp14:editId="4BA3ABE1">
+            <wp:anchor distT="0" distB="0" distL="114300" distR="114300" simplePos="0" relativeHeight="251657216" behindDoc="0" locked="0" layoutInCell="1" allowOverlap="1" wp14:anchorId="3DC29660" wp14:editId="7832BCCF">
               <wp:simplePos x="0" y="0"/>
               <wp:positionH relativeFrom="column">
                 <wp:posOffset>3823970</wp:posOffset>
@@ -5841,7 +5751,7 @@
               <wp:extent cx="2597150" cy="703580"/>
               <wp:effectExtent l="4445" t="3810" r="0" b="0"/>
               <wp:wrapNone/>
-              <wp:docPr id="1236385353" name="Text Box 4"/>
+              <wp:docPr id="1993635695" name="Text Box 4"/>
               <wp:cNvGraphicFramePr>
                 <a:graphicFrameLocks xmlns:a="http://schemas.openxmlformats.org/drawingml/2006/main"/>
               </wp:cNvGraphicFramePr>
@@ -5959,7 +5869,7 @@
         </mc:Choice>
         <mc:Fallback>
           <w:pict>
-            <v:shapetype w14:anchorId="7B90545B" id="_x0000_t202" coordsize="21600,21600" o:spt="202" path="m,l,21600r21600,l21600,xe">
+            <v:shapetype w14:anchorId="3DC29660" id="_x0000_t202" coordsize="21600,21600" o:spt="202" path="m,l,21600r21600,l21600,xe">
               <v:stroke joinstyle="miter"/>
               <v:path gradientshapeok="t" o:connecttype="rect"/>
             </v:shapetype>
@@ -6038,8 +5948,8 @@
         <w:noProof/>
       </w:rPr>
       <w:drawing>
-        <wp:inline distT="0" distB="0" distL="0" distR="0" wp14:anchorId="6B012FF3" wp14:editId="799C24CF">
-          <wp:extent cx="1231900" cy="514350"/>
+        <wp:inline distT="0" distB="0" distL="0" distR="0" wp14:anchorId="6D0FB804" wp14:editId="76AD5BAD">
+          <wp:extent cx="1238250" cy="514350"/>
           <wp:effectExtent l="0" t="0" r="0" b="0"/>
           <wp:docPr id="1" name="Picture 1"/>
           <wp:cNvGraphicFramePr>
@@ -6070,7 +5980,7 @@
                 <pic:spPr bwMode="auto">
                   <a:xfrm>
                     <a:off x="0" y="0"/>
-                    <a:ext cx="1231900" cy="514350"/>
+                    <a:ext cx="1238250" cy="514350"/>
                   </a:xfrm>
                   <a:prstGeom prst="rect">
                     <a:avLst/>
@@ -6104,7 +6014,7 @@
       <mc:AlternateContent>
         <mc:Choice Requires="wps">
           <w:drawing>
-            <wp:anchor distT="0" distB="0" distL="114300" distR="114300" simplePos="0" relativeHeight="251658240" behindDoc="0" locked="0" layoutInCell="1" allowOverlap="1" wp14:anchorId="27997816" wp14:editId="0EBA93DE">
+            <wp:anchor distT="0" distB="0" distL="114300" distR="114300" simplePos="0" relativeHeight="251658240" behindDoc="0" locked="0" layoutInCell="1" allowOverlap="1" wp14:anchorId="0F1354D0" wp14:editId="1766D7ED">
               <wp:simplePos x="0" y="0"/>
               <wp:positionH relativeFrom="column">
                 <wp:posOffset>15875</wp:posOffset>
@@ -6115,7 +6025,7 @@
               <wp:extent cx="5991860" cy="0"/>
               <wp:effectExtent l="6350" t="12065" r="12065" b="6985"/>
               <wp:wrapNone/>
-              <wp:docPr id="833240158" name="Straight Arrow Connector 2"/>
+              <wp:docPr id="620490029" name="Straight Arrow Connector 2"/>
               <wp:cNvGraphicFramePr>
                 <a:graphicFrameLocks xmlns:a="http://schemas.openxmlformats.org/drawingml/2006/main"/>
               </wp:cNvGraphicFramePr>
@@ -6165,7 +6075,7 @@
         </mc:Choice>
         <mc:Fallback>
           <w:pict>
-            <v:shapetype w14:anchorId="2E959C7D" id="_x0000_t32" coordsize="21600,21600" o:spt="32" o:oned="t" path="m,l21600,21600e" filled="f">
+            <v:shapetype w14:anchorId="7DC37298" id="_x0000_t32" coordsize="21600,21600" o:spt="32" o:oned="t" path="m,l21600,21600e" filled="f">
               <v:path arrowok="t" fillok="f" o:connecttype="none"/>
               <o:lock v:ext="edit" shapetype="t"/>
             </v:shapetype>
@@ -6496,16 +6406,16 @@
       </w:rPr>
     </w:lvl>
   </w:abstractNum>
-  <w:num w:numId="1" w16cid:durableId="1716735310">
+  <w:num w:numId="1" w16cid:durableId="1527401467">
     <w:abstractNumId w:val="1"/>
   </w:num>
-  <w:num w:numId="2" w16cid:durableId="2134597113">
+  <w:num w:numId="2" w16cid:durableId="328488234">
     <w:abstractNumId w:val="1"/>
   </w:num>
-  <w:num w:numId="3" w16cid:durableId="1417047984">
+  <w:num w:numId="3" w16cid:durableId="1910992743">
     <w:abstractNumId w:val="1"/>
   </w:num>
-  <w:num w:numId="4" w16cid:durableId="1920872037">
+  <w:num w:numId="4" w16cid:durableId="222370189">
     <w:abstractNumId w:val="0"/>
     <w:lvlOverride w:ilvl="0">
       <w:startOverride w:val="1"/>
@@ -6535,10 +6445,10 @@
       <w:startOverride w:val="1"/>
     </w:lvlOverride>
   </w:num>
-  <w:num w:numId="5" w16cid:durableId="577442829">
+  <w:num w:numId="5" w16cid:durableId="1786658761">
     <w:abstractNumId w:val="0"/>
   </w:num>
-  <w:num w:numId="6" w16cid:durableId="1982728047">
+  <w:num w:numId="6" w16cid:durableId="1317489701">
     <w:abstractNumId w:val="1"/>
     <w:lvlOverride w:ilvl="0">
       <w:startOverride w:val="1"/>
@@ -6568,37 +6478,37 @@
       <w:startOverride w:val="1"/>
     </w:lvlOverride>
   </w:num>
-  <w:num w:numId="7" w16cid:durableId="1511261893">
+  <w:num w:numId="7" w16cid:durableId="1578320740">
     <w:abstractNumId w:val="1"/>
   </w:num>
-  <w:num w:numId="8" w16cid:durableId="1494106543">
+  <w:num w:numId="8" w16cid:durableId="103769280">
     <w:abstractNumId w:val="1"/>
   </w:num>
-  <w:num w:numId="9" w16cid:durableId="697925460">
+  <w:num w:numId="9" w16cid:durableId="1866821908">
     <w:abstractNumId w:val="1"/>
   </w:num>
-  <w:num w:numId="10" w16cid:durableId="2081443366">
+  <w:num w:numId="10" w16cid:durableId="1664818169">
     <w:abstractNumId w:val="1"/>
   </w:num>
-  <w:num w:numId="11" w16cid:durableId="1155756323">
+  <w:num w:numId="11" w16cid:durableId="1158812728">
     <w:abstractNumId w:val="1"/>
   </w:num>
-  <w:num w:numId="12" w16cid:durableId="322438080">
+  <w:num w:numId="12" w16cid:durableId="1441950135">
     <w:abstractNumId w:val="1"/>
   </w:num>
-  <w:num w:numId="13" w16cid:durableId="483862791">
+  <w:num w:numId="13" w16cid:durableId="1459882382">
     <w:abstractNumId w:val="1"/>
   </w:num>
-  <w:num w:numId="14" w16cid:durableId="511454631">
+  <w:num w:numId="14" w16cid:durableId="1276982330">
     <w:abstractNumId w:val="1"/>
   </w:num>
-  <w:num w:numId="15" w16cid:durableId="470948505">
+  <w:num w:numId="15" w16cid:durableId="1608541258">
     <w:abstractNumId w:val="1"/>
   </w:num>
-  <w:num w:numId="16" w16cid:durableId="363486115">
+  <w:num w:numId="16" w16cid:durableId="946888709">
     <w:abstractNumId w:val="1"/>
   </w:num>
-  <w:num w:numId="17" w16cid:durableId="968432987">
+  <w:num w:numId="17" w16cid:durableId="2089308148">
     <w:abstractNumId w:val="1"/>
   </w:num>
 </w:numbering>
@@ -8173,7 +8083,7 @@
 </file>
 
 <file path=customXml/itemProps1.xml><?xml version="1.0" encoding="utf-8"?>
-<ds:datastoreItem xmlns:ds="http://schemas.openxmlformats.org/officeDocument/2006/customXml" ds:itemID="{D14E77A5-7CE9-4938-BF1A-28D6FE1E15CA}">
+<ds:datastoreItem xmlns:ds="http://schemas.openxmlformats.org/officeDocument/2006/customXml" ds:itemID="{32EAB7C0-F829-4C48-B7F1-665EE57714CE}">
   <ds:schemaRefs>
     <ds:schemaRef ds:uri="http://schemas.microsoft.com/office/2006/metadata/longProperties"/>
   </ds:schemaRefs>
@@ -8181,7 +8091,7 @@
 </file>
 
 <file path=customXml/itemProps2.xml><?xml version="1.0" encoding="utf-8"?>
-<ds:datastoreItem xmlns:ds="http://schemas.openxmlformats.org/officeDocument/2006/customXml" ds:itemID="{992BE9F8-B173-4C3E-8FD1-C29A5D387F07}">
+<ds:datastoreItem xmlns:ds="http://schemas.openxmlformats.org/officeDocument/2006/customXml" ds:itemID="{72B676DA-B52B-44BE-B84E-9DBC490BE3AC}">
   <ds:schemaRefs>
     <ds:schemaRef ds:uri="http://schemas.microsoft.com/sharepoint/v3/contenttype/forms"/>
   </ds:schemaRefs>
@@ -8208,7 +8118,7 @@
 </file>
 
 <file path=customXml/itemProps4.xml><?xml version="1.0" encoding="utf-8"?>
-<ds:datastoreItem xmlns:ds="http://schemas.openxmlformats.org/officeDocument/2006/customXml" ds:itemID="{72957DDB-1E03-42E8-872C-E3912DCF5D82}">
+<ds:datastoreItem xmlns:ds="http://schemas.openxmlformats.org/officeDocument/2006/customXml" ds:itemID="{C4F83E24-1763-4844-94BD-8A91E73E1E3A}">
   <ds:schemaRefs>
     <ds:schemaRef ds:uri="http://schemas.microsoft.com/office/2006/metadata/properties"/>
     <ds:schemaRef ds:uri="http://schemas.microsoft.com/office/infopath/2007/PartnerControls"/>

</xml_diff>

<commit_message>
Update LOI template to 5.12.26: revise Monthly Going Hard deposit language
- New template Templates/LOI_Template.docx (was 4.14.26)
- Restructure monthly hard money clause: explicit 30-day cadence, defined
  stop (Closing or termination), and split sentence so non-refundable
  conditions apply to full Earnest Money
- Add monthly_release_to_seller toggle for the new bracketed "released
  to Seller by Title Company" clause
- Mirror language updates in UI preview and tests/compare_ui_vs_doc.py

Co-Authored-By: Claude Opus 4.7 (1M context) <noreply@anthropic.com>
</commit_message>
<xml_diff>
--- a/Templates/LOI_Template.docx
+++ b/Templates/LOI_Template.docx
@@ -1661,7 +1661,35 @@
           <w:sz w:val="22"/>
           <w:szCs w:val="22"/>
         </w:rPr>
-        <w:t xml:space="preserve">”) and </w:t>
+        <w:t>”)</w:t>
+      </w:r>
+      <w:r>
+        <w:rPr>
+          <w:sz w:val="22"/>
+          <w:szCs w:val="22"/>
+        </w:rPr>
+        <w:t>.</w:t>
+      </w:r>
+      <w:r>
+        <w:rPr>
+          <w:sz w:val="22"/>
+          <w:szCs w:val="22"/>
+        </w:rPr>
+        <w:t xml:space="preserve"> </w:t>
+      </w:r>
+      <w:r>
+        <w:rPr>
+          <w:sz w:val="22"/>
+          <w:szCs w:val="22"/>
+        </w:rPr>
+        <w:t>The Earnest Money</w:t>
+      </w:r>
+      <w:r>
+        <w:rPr>
+          <w:sz w:val="22"/>
+          <w:szCs w:val="22"/>
+        </w:rPr>
+        <w:t xml:space="preserve"> </w:t>
       </w:r>
       <w:r>
         <w:rPr>
@@ -1710,7 +1738,21 @@
           <w:sz w:val="22"/>
           <w:szCs w:val="22"/>
         </w:rPr>
-        <w:t>On the 1</w:t>
+        <w:t>Additionally</w:t>
+      </w:r>
+      <w:r>
+        <w:rPr>
+          <w:sz w:val="22"/>
+          <w:szCs w:val="22"/>
+        </w:rPr>
+        <w:t>, beginning o</w:t>
+      </w:r>
+      <w:r>
+        <w:rPr>
+          <w:sz w:val="22"/>
+          <w:szCs w:val="22"/>
+        </w:rPr>
+        <w:t>n the 1</w:t>
       </w:r>
       <w:r>
         <w:rPr>
@@ -1739,6 +1781,13 @@
           <w:sz w:val="22"/>
           <w:szCs w:val="22"/>
         </w:rPr>
+        <w:t xml:space="preserve">and continuing every [thirty (30)] days thereafter until the earlier of Closing or the termination of the Purchase Agreement, </w:t>
+      </w:r>
+      <w:r>
+        <w:rPr>
+          <w:sz w:val="22"/>
+          <w:szCs w:val="22"/>
+        </w:rPr>
         <w:t>[</w:t>
       </w:r>
       <w:r>
@@ -1818,6 +1867,13 @@
           <w:sz w:val="22"/>
           <w:szCs w:val="22"/>
         </w:rPr>
+        <w:t>[</w:t>
+      </w:r>
+      <w:r>
+        <w:rPr>
+          <w:sz w:val="22"/>
+          <w:szCs w:val="22"/>
+        </w:rPr>
         <w:t>,</w:t>
       </w:r>
       <w:r>
@@ -1846,7 +1902,21 @@
           <w:sz w:val="22"/>
           <w:szCs w:val="22"/>
         </w:rPr>
-        <w:t>Seller by Title Company. If Purchaser has not obtained the Governmental Approvals during the Governmental Approvals Period, Purchaser may terminate the Purchase Agreement and the Earnest Money, less the Monthly Releases</w:t>
+        <w:t>Seller by Title Company</w:t>
+      </w:r>
+      <w:r>
+        <w:rPr>
+          <w:sz w:val="22"/>
+          <w:szCs w:val="22"/>
+        </w:rPr>
+        <w:t>]</w:t>
+      </w:r>
+      <w:r>
+        <w:rPr>
+          <w:sz w:val="22"/>
+          <w:szCs w:val="22"/>
+        </w:rPr>
+        <w:t>. If Purchaser has not obtained the Governmental Approvals during the Governmental Approvals Period, Purchaser may terminate the Purchase Agreement and the Earnest Money, less the Monthly Releases</w:t>
       </w:r>
       <w:r>
         <w:rPr>
@@ -5740,7 +5810,7 @@
       <mc:AlternateContent>
         <mc:Choice Requires="wps">
           <w:drawing>
-            <wp:anchor distT="0" distB="0" distL="114300" distR="114300" simplePos="0" relativeHeight="251657216" behindDoc="0" locked="0" layoutInCell="1" allowOverlap="1" wp14:anchorId="3DC29660" wp14:editId="7832BCCF">
+            <wp:anchor distT="0" distB="0" distL="114300" distR="114300" simplePos="0" relativeHeight="251657216" behindDoc="0" locked="0" layoutInCell="1" allowOverlap="1" wp14:anchorId="25B99DC3" wp14:editId="484222CA">
               <wp:simplePos x="0" y="0"/>
               <wp:positionH relativeFrom="column">
                 <wp:posOffset>3823970</wp:posOffset>
@@ -5751,7 +5821,7 @@
               <wp:extent cx="2597150" cy="703580"/>
               <wp:effectExtent l="4445" t="3810" r="0" b="0"/>
               <wp:wrapNone/>
-              <wp:docPr id="1993635695" name="Text Box 4"/>
+              <wp:docPr id="252897341" name="Text Box 4"/>
               <wp:cNvGraphicFramePr>
                 <a:graphicFrameLocks xmlns:a="http://schemas.openxmlformats.org/drawingml/2006/main"/>
               </wp:cNvGraphicFramePr>
@@ -5869,7 +5939,7 @@
         </mc:Choice>
         <mc:Fallback>
           <w:pict>
-            <v:shapetype w14:anchorId="3DC29660" id="_x0000_t202" coordsize="21600,21600" o:spt="202" path="m,l,21600r21600,l21600,xe">
+            <v:shapetype w14:anchorId="25B99DC3" id="_x0000_t202" coordsize="21600,21600" o:spt="202" path="m,l,21600r21600,l21600,xe">
               <v:stroke joinstyle="miter"/>
               <v:path gradientshapeok="t" o:connecttype="rect"/>
             </v:shapetype>
@@ -5948,8 +6018,8 @@
         <w:noProof/>
       </w:rPr>
       <w:drawing>
-        <wp:inline distT="0" distB="0" distL="0" distR="0" wp14:anchorId="6D0FB804" wp14:editId="76AD5BAD">
-          <wp:extent cx="1238250" cy="514350"/>
+        <wp:inline distT="0" distB="0" distL="0" distR="0" wp14:anchorId="5CE61A54" wp14:editId="60F0AA05">
+          <wp:extent cx="1236345" cy="514985"/>
           <wp:effectExtent l="0" t="0" r="0" b="0"/>
           <wp:docPr id="1" name="Picture 1"/>
           <wp:cNvGraphicFramePr>
@@ -5980,7 +6050,7 @@
                 <pic:spPr bwMode="auto">
                   <a:xfrm>
                     <a:off x="0" y="0"/>
-                    <a:ext cx="1238250" cy="514350"/>
+                    <a:ext cx="1236345" cy="514985"/>
                   </a:xfrm>
                   <a:prstGeom prst="rect">
                     <a:avLst/>
@@ -6014,7 +6084,7 @@
       <mc:AlternateContent>
         <mc:Choice Requires="wps">
           <w:drawing>
-            <wp:anchor distT="0" distB="0" distL="114300" distR="114300" simplePos="0" relativeHeight="251658240" behindDoc="0" locked="0" layoutInCell="1" allowOverlap="1" wp14:anchorId="0F1354D0" wp14:editId="1766D7ED">
+            <wp:anchor distT="0" distB="0" distL="114300" distR="114300" simplePos="0" relativeHeight="251658240" behindDoc="0" locked="0" layoutInCell="1" allowOverlap="1" wp14:anchorId="028CF637" wp14:editId="04E859A4">
               <wp:simplePos x="0" y="0"/>
               <wp:positionH relativeFrom="column">
                 <wp:posOffset>15875</wp:posOffset>
@@ -6025,7 +6095,7 @@
               <wp:extent cx="5991860" cy="0"/>
               <wp:effectExtent l="6350" t="12065" r="12065" b="6985"/>
               <wp:wrapNone/>
-              <wp:docPr id="620490029" name="Straight Arrow Connector 2"/>
+              <wp:docPr id="1757863080" name="Straight Arrow Connector 2"/>
               <wp:cNvGraphicFramePr>
                 <a:graphicFrameLocks xmlns:a="http://schemas.openxmlformats.org/drawingml/2006/main"/>
               </wp:cNvGraphicFramePr>
@@ -6075,7 +6145,7 @@
         </mc:Choice>
         <mc:Fallback>
           <w:pict>
-            <v:shapetype w14:anchorId="7DC37298" id="_x0000_t32" coordsize="21600,21600" o:spt="32" o:oned="t" path="m,l21600,21600e" filled="f">
+            <v:shapetype w14:anchorId="09957C8C" id="_x0000_t32" coordsize="21600,21600" o:spt="32" o:oned="t" path="m,l21600,21600e" filled="f">
               <v:path arrowok="t" fillok="f" o:connecttype="none"/>
               <o:lock v:ext="edit" shapetype="t"/>
             </v:shapetype>
@@ -6406,16 +6476,16 @@
       </w:rPr>
     </w:lvl>
   </w:abstractNum>
-  <w:num w:numId="1" w16cid:durableId="1527401467">
+  <w:num w:numId="1" w16cid:durableId="1734543355">
     <w:abstractNumId w:val="1"/>
   </w:num>
-  <w:num w:numId="2" w16cid:durableId="328488234">
+  <w:num w:numId="2" w16cid:durableId="1421758854">
     <w:abstractNumId w:val="1"/>
   </w:num>
-  <w:num w:numId="3" w16cid:durableId="1910992743">
+  <w:num w:numId="3" w16cid:durableId="1442188348">
     <w:abstractNumId w:val="1"/>
   </w:num>
-  <w:num w:numId="4" w16cid:durableId="222370189">
+  <w:num w:numId="4" w16cid:durableId="388309496">
     <w:abstractNumId w:val="0"/>
     <w:lvlOverride w:ilvl="0">
       <w:startOverride w:val="1"/>
@@ -6445,10 +6515,10 @@
       <w:startOverride w:val="1"/>
     </w:lvlOverride>
   </w:num>
-  <w:num w:numId="5" w16cid:durableId="1786658761">
+  <w:num w:numId="5" w16cid:durableId="1616672620">
     <w:abstractNumId w:val="0"/>
   </w:num>
-  <w:num w:numId="6" w16cid:durableId="1317489701">
+  <w:num w:numId="6" w16cid:durableId="971443747">
     <w:abstractNumId w:val="1"/>
     <w:lvlOverride w:ilvl="0">
       <w:startOverride w:val="1"/>
@@ -6478,37 +6548,37 @@
       <w:startOverride w:val="1"/>
     </w:lvlOverride>
   </w:num>
-  <w:num w:numId="7" w16cid:durableId="1578320740">
+  <w:num w:numId="7" w16cid:durableId="2121953654">
     <w:abstractNumId w:val="1"/>
   </w:num>
-  <w:num w:numId="8" w16cid:durableId="103769280">
+  <w:num w:numId="8" w16cid:durableId="209222325">
     <w:abstractNumId w:val="1"/>
   </w:num>
-  <w:num w:numId="9" w16cid:durableId="1866821908">
+  <w:num w:numId="9" w16cid:durableId="1071079634">
     <w:abstractNumId w:val="1"/>
   </w:num>
-  <w:num w:numId="10" w16cid:durableId="1664818169">
+  <w:num w:numId="10" w16cid:durableId="713966495">
     <w:abstractNumId w:val="1"/>
   </w:num>
-  <w:num w:numId="11" w16cid:durableId="1158812728">
+  <w:num w:numId="11" w16cid:durableId="1750421127">
     <w:abstractNumId w:val="1"/>
   </w:num>
-  <w:num w:numId="12" w16cid:durableId="1441950135">
+  <w:num w:numId="12" w16cid:durableId="1557474510">
     <w:abstractNumId w:val="1"/>
   </w:num>
-  <w:num w:numId="13" w16cid:durableId="1459882382">
+  <w:num w:numId="13" w16cid:durableId="388849215">
     <w:abstractNumId w:val="1"/>
   </w:num>
-  <w:num w:numId="14" w16cid:durableId="1276982330">
+  <w:num w:numId="14" w16cid:durableId="1914387586">
     <w:abstractNumId w:val="1"/>
   </w:num>
-  <w:num w:numId="15" w16cid:durableId="1608541258">
+  <w:num w:numId="15" w16cid:durableId="369456679">
     <w:abstractNumId w:val="1"/>
   </w:num>
-  <w:num w:numId="16" w16cid:durableId="946888709">
+  <w:num w:numId="16" w16cid:durableId="2013406320">
     <w:abstractNumId w:val="1"/>
   </w:num>
-  <w:num w:numId="17" w16cid:durableId="2089308148">
+  <w:num w:numId="17" w16cid:durableId="395737282">
     <w:abstractNumId w:val="1"/>
   </w:num>
 </w:numbering>
@@ -8118,7 +8188,7 @@
 </file>
 
 <file path=customXml/itemProps4.xml><?xml version="1.0" encoding="utf-8"?>
-<ds:datastoreItem xmlns:ds="http://schemas.openxmlformats.org/officeDocument/2006/customXml" ds:itemID="{C4F83E24-1763-4844-94BD-8A91E73E1E3A}">
+<ds:datastoreItem xmlns:ds="http://schemas.openxmlformats.org/officeDocument/2006/customXml" ds:itemID="{12ED6026-BF0C-4E8E-B0FF-62BABC729999}">
   <ds:schemaRefs>
     <ds:schemaRef ds:uri="http://schemas.microsoft.com/office/2006/metadata/properties"/>
     <ds:schemaRef ds:uri="http://schemas.microsoft.com/office/infopath/2007/PartnerControls"/>

</xml_diff>